<commit_message>
Fluency Lab worksheets, Module 4: every fraction and answer space stacked, fewer words
Co-Authored-By: Claude Opus 5.5 <noreply@anthropic.com>
Claude-Session: https://claude.ai/code/session_014YTiyifGRnSLg5sxKHwHzH
</commit_message>
<xml_diff>
--- a/grade8/Fluency-Lab-Package/module-materials/Module-4-Fractions/FluencyLab_M4_AddSub_Guided.docx
+++ b/grade8/Fluency-Lab-Package/module-materials/Module-4-Fractions/FluencyLab_M4_AddSub_Guided.docx
@@ -49,6 +49,9 @@
         <w:gridCol w:w="5960"/>
       </w:tblGrid>
       <w:tr>
+        <w:trPr>
+          <w:cantSplit/>
+        </w:trPr>
         <w:tc>
           <w:tcPr>
             <w:tcW w:type="dxa" w:w="3400"/>
@@ -136,7 +139,7 @@
           <w:sz w:val="26"/>
           <w:szCs w:val="26"/>
         </w:rPr>
-        <w:t xml:space="preserve">Refresher — you need a common denominator</w:t>
+        <w:t xml:space="preserve">Refresher</w:t>
       </w:r>
     </w:p>
     <w:p>
@@ -149,7 +152,7 @@
           <w:sz w:val="22"/>
           <w:szCs w:val="22"/>
         </w:rPr>
-        <w:t xml:space="preserve">Same bottom? Just add or subtract the tops. Different bottoms? Make them the same first.</w:t>
+        <w:t xml:space="preserve">Different bottoms? Make them the same first.</w:t>
       </w:r>
     </w:p>
     <w:tbl>
@@ -168,6 +171,9 @@
         <w:gridCol w:w="9360"/>
       </w:tblGrid>
       <w:tr>
+        <w:trPr>
+          <w:cantSplit/>
+        </w:trPr>
         <w:tc>
           <w:tcPr>
             <w:tcW w:type="dxa" w:w="9360"/>
@@ -923,7 +929,7 @@
           <w:sz w:val="22"/>
           <w:szCs w:val="22"/>
         </w:rPr>
-        <w:t xml:space="preserve">Rewrite: 1/2 = 3/6 and 1/3 = 2/6 (multiply top and bottom to reach 6).</w:t>
+        <w:t xml:space="preserve">Rewrite both fractions over 6.</w:t>
       </w:r>
     </w:p>
     <w:p>
@@ -940,7 +946,7 @@
           <w:sz w:val="22"/>
           <w:szCs w:val="22"/>
         </w:rPr>
-        <w:t xml:space="preserve">Add the tops, keep the bottom: 3 + 2 = 5 → 5/6. Simplify if you can.</w:t>
+        <w:t xml:space="preserve">Add the tops. Keep the bottom.</w:t>
       </w:r>
     </w:p>
     <w:p>
@@ -953,7 +959,7 @@
           <w:sz w:val="22"/>
           <w:szCs w:val="22"/>
         </w:rPr>
-        <w:t xml:space="preserve">We never add the bottoms, and we never use the “butterfly.” The common denominator is the real method — it keeps working for three or more fractions.</w:t>
+        <w:t xml:space="preserve">Never add the bottoms.</w:t>
       </w:r>
     </w:p>
     <w:p>
@@ -969,7 +975,7 @@
           <w:sz w:val="26"/>
           <w:szCs w:val="26"/>
         </w:rPr>
-        <w:t xml:space="preserve">Guided practice — fill in each step</w:t>
+        <w:t xml:space="preserve">Guided practice</w:t>
       </w:r>
     </w:p>
     <w:p>
@@ -1011,6 +1017,9 @@
         <w:gridCol w:w="9360"/>
       </w:tblGrid>
       <w:tr>
+        <w:trPr>
+          <w:cantSplit/>
+        </w:trPr>
         <w:tc>
           <w:tcPr>
             <w:tcW w:type="dxa" w:w="9360"/>
@@ -1030,7 +1039,7 @@
           </w:tcPr>
           <w:tbl>
             <w:tblPr>
-              <w:tblW w:type="dxa" w:w="1920"/>
+              <w:tblW w:type="dxa" w:w="6220"/>
               <w:jc w:val="left"/>
               <w:tblBorders>
                 <w:top w:val="single" w:color="auto" w:sz="4"/>
@@ -1045,6 +1054,8 @@
               <w:gridCol w:w="700"/>
               <w:gridCol w:w="520"/>
               <w:gridCol w:w="700"/>
+              <w:gridCol w:w="500"/>
+              <w:gridCol w:w="3800"/>
             </w:tblGrid>
             <w:tr>
               <w:tc>
@@ -1297,49 +1308,810 @@
                 </w:tbl>
                 <w:p/>
               </w:tc>
+              <w:tc>
+                <w:tcPr>
+                  <w:tcW w:type="dxa" w:w="500"/>
+                  <w:tcBorders>
+                    <w:top w:val="none" w:color="FFFFFF" w:sz="0"/>
+                    <w:left w:val="none" w:color="FFFFFF" w:sz="0"/>
+                    <w:bottom w:val="none" w:color="FFFFFF" w:sz="0"/>
+                    <w:right w:val="none" w:color="FFFFFF" w:sz="0"/>
+                  </w:tcBorders>
+                  <w:tcMar>
+                    <w:top w:type="dxa" w:w="30"/>
+                    <w:left w:type="dxa" w:w="20"/>
+                    <w:bottom w:type="dxa" w:w="30"/>
+                    <w:right w:type="dxa" w:w="20"/>
+                  </w:tcMar>
+                  <w:vAlign w:val="center"/>
+                </w:tcPr>
+                <w:p/>
+              </w:tc>
+              <w:tc>
+                <w:tcPr>
+                  <w:tcW w:type="dxa" w:w="3800"/>
+                  <w:tcBorders>
+                    <w:top w:val="none" w:color="FFFFFF" w:sz="0"/>
+                    <w:left w:val="none" w:color="FFFFFF" w:sz="0"/>
+                    <w:bottom w:val="none" w:color="FFFFFF" w:sz="0"/>
+                    <w:right w:val="none" w:color="FFFFFF" w:sz="0"/>
+                  </w:tcBorders>
+                  <w:tcMar>
+                    <w:top w:type="dxa" w:w="30"/>
+                    <w:left w:type="dxa" w:w="20"/>
+                    <w:bottom w:type="dxa" w:w="30"/>
+                    <w:right w:type="dxa" w:w="20"/>
+                  </w:tcMar>
+                  <w:vAlign w:val="center"/>
+                </w:tcPr>
+                <w:p>
+                  <w:pPr>
+                    <w:spacing w:after="0"/>
+                  </w:pPr>
+                  <w:r>
+                    <w:rPr>
+                      <w:rFonts w:ascii="Consolas" w:cs="Consolas" w:eastAsia="Consolas" w:hAnsi="Consolas"/>
+                      <w:color w:val="1A1A1A"/>
+                      <w:sz w:val="22"/>
+                      <w:szCs w:val="22"/>
+                    </w:rPr>
+                    <w:t xml:space="preserve">Common denominator: ______</w:t>
+                  </w:r>
+                </w:p>
+              </w:tc>
             </w:tr>
           </w:tbl>
           <w:p>
             <w:pPr>
-              <w:spacing w:after="60" w:line="300"/>
+              <w:spacing w:after="0" w:line="40" w:lineRule="exact"/>
             </w:pPr>
-            <w:r>
-              <w:rPr>
-                <w:rFonts w:ascii="Consolas" w:cs="Consolas" w:eastAsia="Consolas" w:hAnsi="Consolas"/>
-                <w:color w:val="1A1A1A"/>
-                <w:sz w:val="22"/>
-                <w:szCs w:val="22"/>
-              </w:rPr>
-              <w:t xml:space="preserve">Common denominator of 4 and 6:  ______</w:t>
-            </w:r>
           </w:p>
+          <w:tbl>
+            <w:tblPr>
+              <w:tblW w:type="dxa" w:w="4620"/>
+              <w:jc w:val="left"/>
+              <w:tblBorders>
+                <w:top w:val="single" w:color="auto" w:sz="4"/>
+                <w:left w:val="single" w:color="auto" w:sz="4"/>
+                <w:bottom w:val="single" w:color="auto" w:sz="4"/>
+                <w:right w:val="single" w:color="auto" w:sz="4"/>
+                <w:insideH w:val="single" w:color="auto" w:sz="4"/>
+                <w:insideV w:val="single" w:color="auto" w:sz="4"/>
+              </w:tblBorders>
+            </w:tblPr>
+            <w:tblGrid>
+              <w:gridCol w:w="700"/>
+              <w:gridCol w:w="520"/>
+              <w:gridCol w:w="740"/>
+              <w:gridCol w:w="700"/>
+              <w:gridCol w:w="700"/>
+              <w:gridCol w:w="520"/>
+              <w:gridCol w:w="740"/>
+            </w:tblGrid>
+            <w:tr>
+              <w:tc>
+                <w:tcPr>
+                  <w:tcW w:type="dxa" w:w="700"/>
+                  <w:tcBorders>
+                    <w:top w:val="none" w:color="FFFFFF" w:sz="0"/>
+                    <w:left w:val="none" w:color="FFFFFF" w:sz="0"/>
+                    <w:bottom w:val="none" w:color="FFFFFF" w:sz="0"/>
+                    <w:right w:val="none" w:color="FFFFFF" w:sz="0"/>
+                  </w:tcBorders>
+                  <w:tcMar>
+                    <w:top w:type="dxa" w:w="30"/>
+                    <w:left w:type="dxa" w:w="20"/>
+                    <w:bottom w:type="dxa" w:w="30"/>
+                    <w:right w:type="dxa" w:w="20"/>
+                  </w:tcMar>
+                  <w:vAlign w:val="center"/>
+                </w:tcPr>
+                <w:tbl>
+                  <w:tblPr>
+                    <w:tblW w:type="dxa" w:w="600"/>
+                    <w:jc w:val="center"/>
+                    <w:tblBorders>
+                      <w:top w:val="single" w:color="auto" w:sz="4"/>
+                      <w:left w:val="single" w:color="auto" w:sz="4"/>
+                      <w:bottom w:val="single" w:color="auto" w:sz="4"/>
+                      <w:right w:val="single" w:color="auto" w:sz="4"/>
+                      <w:insideH w:val="none" w:color="FFFFFF" w:sz="0"/>
+                      <w:insideV w:val="single" w:color="auto" w:sz="4"/>
+                    </w:tblBorders>
+                  </w:tblPr>
+                  <w:tblGrid>
+                    <w:gridCol w:w="600"/>
+                  </w:tblGrid>
+                  <w:tr>
+                    <w:tc>
+                      <w:tcPr>
+                        <w:tcW w:type="dxa" w:w="520"/>
+                        <w:tcBorders>
+                          <w:top w:val="none" w:color="FFFFFF" w:sz="0"/>
+                          <w:left w:val="none" w:color="FFFFFF" w:sz="0"/>
+                          <w:bottom w:val="single" w:color="1A1A1A" w:sz="8"/>
+                          <w:right w:val="none" w:color="FFFFFF" w:sz="0"/>
+                        </w:tcBorders>
+                        <w:tcMar>
+                          <w:top w:type="dxa" w:w="0"/>
+                          <w:left w:type="dxa" w:w="30"/>
+                          <w:bottom w:type="dxa" w:w="0"/>
+                          <w:right w:type="dxa" w:w="30"/>
+                        </w:tcMar>
+                      </w:tcPr>
+                      <w:p>
+                        <w:pPr>
+                          <w:spacing w:after="0" w:line="230"/>
+                          <w:jc w:val="center"/>
+                        </w:pPr>
+                        <w:r>
+                          <w:rPr>
+                            <w:rFonts w:ascii="Consolas" w:cs="Consolas" w:eastAsia="Consolas" w:hAnsi="Consolas"/>
+                            <w:b/>
+                            <w:bCs/>
+                            <w:color w:val="1A1A1A"/>
+                            <w:sz w:val="26"/>
+                            <w:szCs w:val="26"/>
+                          </w:rPr>
+                          <w:t xml:space="preserve">1</w:t>
+                        </w:r>
+                      </w:p>
+                    </w:tc>
+                  </w:tr>
+                  <w:tr>
+                    <w:tc>
+                      <w:tcPr>
+                        <w:tcW w:type="dxa" w:w="520"/>
+                        <w:tcBorders>
+                          <w:top w:val="none" w:color="FFFFFF" w:sz="0"/>
+                          <w:left w:val="none" w:color="FFFFFF" w:sz="0"/>
+                          <w:bottom w:val="none" w:color="FFFFFF" w:sz="0"/>
+                          <w:right w:val="none" w:color="FFFFFF" w:sz="0"/>
+                        </w:tcBorders>
+                        <w:tcMar>
+                          <w:top w:type="dxa" w:w="0"/>
+                          <w:left w:type="dxa" w:w="30"/>
+                          <w:bottom w:type="dxa" w:w="0"/>
+                          <w:right w:type="dxa" w:w="30"/>
+                        </w:tcMar>
+                      </w:tcPr>
+                      <w:p>
+                        <w:pPr>
+                          <w:spacing w:after="0" w:line="230"/>
+                          <w:jc w:val="center"/>
+                        </w:pPr>
+                        <w:r>
+                          <w:rPr>
+                            <w:rFonts w:ascii="Consolas" w:cs="Consolas" w:eastAsia="Consolas" w:hAnsi="Consolas"/>
+                            <w:b/>
+                            <w:bCs/>
+                            <w:color w:val="1A1A1A"/>
+                            <w:sz w:val="26"/>
+                            <w:szCs w:val="26"/>
+                          </w:rPr>
+                          <w:t xml:space="preserve">4</w:t>
+                        </w:r>
+                      </w:p>
+                    </w:tc>
+                  </w:tr>
+                </w:tbl>
+                <w:p/>
+              </w:tc>
+              <w:tc>
+                <w:tcPr>
+                  <w:tcW w:type="dxa" w:w="520"/>
+                  <w:tcBorders>
+                    <w:top w:val="none" w:color="FFFFFF" w:sz="0"/>
+                    <w:left w:val="none" w:color="FFFFFF" w:sz="0"/>
+                    <w:bottom w:val="none" w:color="FFFFFF" w:sz="0"/>
+                    <w:right w:val="none" w:color="FFFFFF" w:sz="0"/>
+                  </w:tcBorders>
+                  <w:tcMar>
+                    <w:top w:type="dxa" w:w="30"/>
+                    <w:left w:type="dxa" w:w="10"/>
+                    <w:bottom w:type="dxa" w:w="30"/>
+                    <w:right w:type="dxa" w:w="10"/>
+                  </w:tcMar>
+                  <w:vAlign w:val="center"/>
+                </w:tcPr>
+                <w:p>
+                  <w:pPr>
+                    <w:jc w:val="center"/>
+                  </w:pPr>
+                  <w:r>
+                    <w:rPr>
+                      <w:rFonts w:ascii="Consolas" w:cs="Consolas" w:eastAsia="Consolas" w:hAnsi="Consolas"/>
+                      <w:b/>
+                      <w:bCs/>
+                      <w:color w:val="7A86A8"/>
+                      <w:sz w:val="26"/>
+                      <w:szCs w:val="26"/>
+                    </w:rPr>
+                    <w:t xml:space="preserve">=</w:t>
+                  </w:r>
+                </w:p>
+              </w:tc>
+              <w:tc>
+                <w:tcPr>
+                  <w:tcW w:type="dxa" w:w="740"/>
+                  <w:tcBorders>
+                    <w:top w:val="none" w:color="FFFFFF" w:sz="0"/>
+                    <w:left w:val="none" w:color="FFFFFF" w:sz="0"/>
+                    <w:bottom w:val="none" w:color="FFFFFF" w:sz="0"/>
+                    <w:right w:val="none" w:color="FFFFFF" w:sz="0"/>
+                  </w:tcBorders>
+                  <w:tcMar>
+                    <w:top w:type="dxa" w:w="30"/>
+                    <w:left w:type="dxa" w:w="20"/>
+                    <w:bottom w:type="dxa" w:w="30"/>
+                    <w:right w:type="dxa" w:w="20"/>
+                  </w:tcMar>
+                  <w:vAlign w:val="center"/>
+                </w:tcPr>
+                <w:tbl>
+                  <w:tblPr>
+                    <w:tblW w:type="dxa" w:w="640"/>
+                    <w:jc w:val="center"/>
+                    <w:tblBorders>
+                      <w:top w:val="single" w:color="auto" w:sz="4"/>
+                      <w:left w:val="single" w:color="auto" w:sz="4"/>
+                      <w:bottom w:val="single" w:color="auto" w:sz="4"/>
+                      <w:right w:val="single" w:color="auto" w:sz="4"/>
+                      <w:insideH w:val="none" w:color="FFFFFF" w:sz="0"/>
+                      <w:insideV w:val="single" w:color="auto" w:sz="4"/>
+                    </w:tblBorders>
+                  </w:tblPr>
+                  <w:tblGrid>
+                    <w:gridCol w:w="640"/>
+                  </w:tblGrid>
+                  <w:tr>
+                    <w:tc>
+                      <w:tcPr>
+                        <w:tcW w:type="dxa" w:w="520"/>
+                        <w:tcBorders>
+                          <w:top w:val="dashed" w:color="9AA3B5" w:sz="6"/>
+                          <w:left w:val="dashed" w:color="9AA3B5" w:sz="6"/>
+                          <w:bottom w:val="single" w:color="1A1A1A" w:sz="8"/>
+                          <w:right w:val="dashed" w:color="9AA3B5" w:sz="6"/>
+                        </w:tcBorders>
+                        <w:tcMar>
+                          <w:top w:type="dxa" w:w="0"/>
+                          <w:left w:type="dxa" w:w="30"/>
+                          <w:bottom w:type="dxa" w:w="0"/>
+                          <w:right w:type="dxa" w:w="30"/>
+                        </w:tcMar>
+                      </w:tcPr>
+                      <w:p>
+                        <w:pPr>
+                          <w:spacing w:after="0" w:line="250"/>
+                          <w:jc w:val="center"/>
+                        </w:pPr>
+                        <w:r>
+                          <w:rPr>
+                            <w:rFonts w:ascii="Consolas" w:cs="Consolas" w:eastAsia="Consolas" w:hAnsi="Consolas"/>
+                            <w:b/>
+                            <w:bCs/>
+                            <w:color w:val="1A1A1A"/>
+                            <w:sz w:val="26"/>
+                            <w:szCs w:val="26"/>
+                          </w:rPr>
+                          <w:t xml:space="preserve">   </w:t>
+                        </w:r>
+                      </w:p>
+                    </w:tc>
+                  </w:tr>
+                  <w:tr>
+                    <w:tc>
+                      <w:tcPr>
+                        <w:tcW w:type="dxa" w:w="520"/>
+                        <w:tcBorders>
+                          <w:top w:val="none" w:color="FFFFFF" w:sz="0"/>
+                          <w:left w:val="dashed" w:color="9AA3B5" w:sz="6"/>
+                          <w:bottom w:val="dashed" w:color="9AA3B5" w:sz="6"/>
+                          <w:right w:val="dashed" w:color="9AA3B5" w:sz="6"/>
+                        </w:tcBorders>
+                        <w:tcMar>
+                          <w:top w:type="dxa" w:w="0"/>
+                          <w:left w:type="dxa" w:w="30"/>
+                          <w:bottom w:type="dxa" w:w="0"/>
+                          <w:right w:type="dxa" w:w="30"/>
+                        </w:tcMar>
+                      </w:tcPr>
+                      <w:p>
+                        <w:pPr>
+                          <w:spacing w:after="0" w:line="250"/>
+                          <w:jc w:val="center"/>
+                        </w:pPr>
+                        <w:r>
+                          <w:rPr>
+                            <w:rFonts w:ascii="Consolas" w:cs="Consolas" w:eastAsia="Consolas" w:hAnsi="Consolas"/>
+                            <w:b/>
+                            <w:bCs/>
+                            <w:color w:val="1A1A1A"/>
+                            <w:sz w:val="26"/>
+                            <w:szCs w:val="26"/>
+                          </w:rPr>
+                          <w:t xml:space="preserve">   </w:t>
+                        </w:r>
+                      </w:p>
+                    </w:tc>
+                  </w:tr>
+                </w:tbl>
+                <w:p/>
+              </w:tc>
+              <w:tc>
+                <w:tcPr>
+                  <w:tcW w:type="dxa" w:w="700"/>
+                  <w:tcBorders>
+                    <w:top w:val="none" w:color="FFFFFF" w:sz="0"/>
+                    <w:left w:val="none" w:color="FFFFFF" w:sz="0"/>
+                    <w:bottom w:val="none" w:color="FFFFFF" w:sz="0"/>
+                    <w:right w:val="none" w:color="FFFFFF" w:sz="0"/>
+                  </w:tcBorders>
+                  <w:tcMar>
+                    <w:top w:type="dxa" w:w="30"/>
+                    <w:left w:type="dxa" w:w="20"/>
+                    <w:bottom w:type="dxa" w:w="30"/>
+                    <w:right w:type="dxa" w:w="20"/>
+                  </w:tcMar>
+                  <w:vAlign w:val="center"/>
+                </w:tcPr>
+                <w:p/>
+              </w:tc>
+              <w:tc>
+                <w:tcPr>
+                  <w:tcW w:type="dxa" w:w="700"/>
+                  <w:tcBorders>
+                    <w:top w:val="none" w:color="FFFFFF" w:sz="0"/>
+                    <w:left w:val="none" w:color="FFFFFF" w:sz="0"/>
+                    <w:bottom w:val="none" w:color="FFFFFF" w:sz="0"/>
+                    <w:right w:val="none" w:color="FFFFFF" w:sz="0"/>
+                  </w:tcBorders>
+                  <w:tcMar>
+                    <w:top w:type="dxa" w:w="30"/>
+                    <w:left w:type="dxa" w:w="20"/>
+                    <w:bottom w:type="dxa" w:w="30"/>
+                    <w:right w:type="dxa" w:w="20"/>
+                  </w:tcMar>
+                  <w:vAlign w:val="center"/>
+                </w:tcPr>
+                <w:tbl>
+                  <w:tblPr>
+                    <w:tblW w:type="dxa" w:w="600"/>
+                    <w:jc w:val="center"/>
+                    <w:tblBorders>
+                      <w:top w:val="single" w:color="auto" w:sz="4"/>
+                      <w:left w:val="single" w:color="auto" w:sz="4"/>
+                      <w:bottom w:val="single" w:color="auto" w:sz="4"/>
+                      <w:right w:val="single" w:color="auto" w:sz="4"/>
+                      <w:insideH w:val="none" w:color="FFFFFF" w:sz="0"/>
+                      <w:insideV w:val="single" w:color="auto" w:sz="4"/>
+                    </w:tblBorders>
+                  </w:tblPr>
+                  <w:tblGrid>
+                    <w:gridCol w:w="600"/>
+                  </w:tblGrid>
+                  <w:tr>
+                    <w:tc>
+                      <w:tcPr>
+                        <w:tcW w:type="dxa" w:w="520"/>
+                        <w:tcBorders>
+                          <w:top w:val="none" w:color="FFFFFF" w:sz="0"/>
+                          <w:left w:val="none" w:color="FFFFFF" w:sz="0"/>
+                          <w:bottom w:val="single" w:color="1A1A1A" w:sz="8"/>
+                          <w:right w:val="none" w:color="FFFFFF" w:sz="0"/>
+                        </w:tcBorders>
+                        <w:tcMar>
+                          <w:top w:type="dxa" w:w="0"/>
+                          <w:left w:type="dxa" w:w="30"/>
+                          <w:bottom w:type="dxa" w:w="0"/>
+                          <w:right w:type="dxa" w:w="30"/>
+                        </w:tcMar>
+                      </w:tcPr>
+                      <w:p>
+                        <w:pPr>
+                          <w:spacing w:after="0" w:line="230"/>
+                          <w:jc w:val="center"/>
+                        </w:pPr>
+                        <w:r>
+                          <w:rPr>
+                            <w:rFonts w:ascii="Consolas" w:cs="Consolas" w:eastAsia="Consolas" w:hAnsi="Consolas"/>
+                            <w:b/>
+                            <w:bCs/>
+                            <w:color w:val="1A1A1A"/>
+                            <w:sz w:val="26"/>
+                            <w:szCs w:val="26"/>
+                          </w:rPr>
+                          <w:t xml:space="preserve">1</w:t>
+                        </w:r>
+                      </w:p>
+                    </w:tc>
+                  </w:tr>
+                  <w:tr>
+                    <w:tc>
+                      <w:tcPr>
+                        <w:tcW w:type="dxa" w:w="520"/>
+                        <w:tcBorders>
+                          <w:top w:val="none" w:color="FFFFFF" w:sz="0"/>
+                          <w:left w:val="none" w:color="FFFFFF" w:sz="0"/>
+                          <w:bottom w:val="none" w:color="FFFFFF" w:sz="0"/>
+                          <w:right w:val="none" w:color="FFFFFF" w:sz="0"/>
+                        </w:tcBorders>
+                        <w:tcMar>
+                          <w:top w:type="dxa" w:w="0"/>
+                          <w:left w:type="dxa" w:w="30"/>
+                          <w:bottom w:type="dxa" w:w="0"/>
+                          <w:right w:type="dxa" w:w="30"/>
+                        </w:tcMar>
+                      </w:tcPr>
+                      <w:p>
+                        <w:pPr>
+                          <w:spacing w:after="0" w:line="230"/>
+                          <w:jc w:val="center"/>
+                        </w:pPr>
+                        <w:r>
+                          <w:rPr>
+                            <w:rFonts w:ascii="Consolas" w:cs="Consolas" w:eastAsia="Consolas" w:hAnsi="Consolas"/>
+                            <w:b/>
+                            <w:bCs/>
+                            <w:color w:val="1A1A1A"/>
+                            <w:sz w:val="26"/>
+                            <w:szCs w:val="26"/>
+                          </w:rPr>
+                          <w:t xml:space="preserve">6</w:t>
+                        </w:r>
+                      </w:p>
+                    </w:tc>
+                  </w:tr>
+                </w:tbl>
+                <w:p/>
+              </w:tc>
+              <w:tc>
+                <w:tcPr>
+                  <w:tcW w:type="dxa" w:w="520"/>
+                  <w:tcBorders>
+                    <w:top w:val="none" w:color="FFFFFF" w:sz="0"/>
+                    <w:left w:val="none" w:color="FFFFFF" w:sz="0"/>
+                    <w:bottom w:val="none" w:color="FFFFFF" w:sz="0"/>
+                    <w:right w:val="none" w:color="FFFFFF" w:sz="0"/>
+                  </w:tcBorders>
+                  <w:tcMar>
+                    <w:top w:type="dxa" w:w="30"/>
+                    <w:left w:type="dxa" w:w="10"/>
+                    <w:bottom w:type="dxa" w:w="30"/>
+                    <w:right w:type="dxa" w:w="10"/>
+                  </w:tcMar>
+                  <w:vAlign w:val="center"/>
+                </w:tcPr>
+                <w:p>
+                  <w:pPr>
+                    <w:jc w:val="center"/>
+                  </w:pPr>
+                  <w:r>
+                    <w:rPr>
+                      <w:rFonts w:ascii="Consolas" w:cs="Consolas" w:eastAsia="Consolas" w:hAnsi="Consolas"/>
+                      <w:b/>
+                      <w:bCs/>
+                      <w:color w:val="7A86A8"/>
+                      <w:sz w:val="26"/>
+                      <w:szCs w:val="26"/>
+                    </w:rPr>
+                    <w:t xml:space="preserve">=</w:t>
+                  </w:r>
+                </w:p>
+              </w:tc>
+              <w:tc>
+                <w:tcPr>
+                  <w:tcW w:type="dxa" w:w="740"/>
+                  <w:tcBorders>
+                    <w:top w:val="none" w:color="FFFFFF" w:sz="0"/>
+                    <w:left w:val="none" w:color="FFFFFF" w:sz="0"/>
+                    <w:bottom w:val="none" w:color="FFFFFF" w:sz="0"/>
+                    <w:right w:val="none" w:color="FFFFFF" w:sz="0"/>
+                  </w:tcBorders>
+                  <w:tcMar>
+                    <w:top w:type="dxa" w:w="30"/>
+                    <w:left w:type="dxa" w:w="20"/>
+                    <w:bottom w:type="dxa" w:w="30"/>
+                    <w:right w:type="dxa" w:w="20"/>
+                  </w:tcMar>
+                  <w:vAlign w:val="center"/>
+                </w:tcPr>
+                <w:tbl>
+                  <w:tblPr>
+                    <w:tblW w:type="dxa" w:w="640"/>
+                    <w:jc w:val="center"/>
+                    <w:tblBorders>
+                      <w:top w:val="single" w:color="auto" w:sz="4"/>
+                      <w:left w:val="single" w:color="auto" w:sz="4"/>
+                      <w:bottom w:val="single" w:color="auto" w:sz="4"/>
+                      <w:right w:val="single" w:color="auto" w:sz="4"/>
+                      <w:insideH w:val="none" w:color="FFFFFF" w:sz="0"/>
+                      <w:insideV w:val="single" w:color="auto" w:sz="4"/>
+                    </w:tblBorders>
+                  </w:tblPr>
+                  <w:tblGrid>
+                    <w:gridCol w:w="640"/>
+                  </w:tblGrid>
+                  <w:tr>
+                    <w:tc>
+                      <w:tcPr>
+                        <w:tcW w:type="dxa" w:w="520"/>
+                        <w:tcBorders>
+                          <w:top w:val="dashed" w:color="9AA3B5" w:sz="6"/>
+                          <w:left w:val="dashed" w:color="9AA3B5" w:sz="6"/>
+                          <w:bottom w:val="single" w:color="1A1A1A" w:sz="8"/>
+                          <w:right w:val="dashed" w:color="9AA3B5" w:sz="6"/>
+                        </w:tcBorders>
+                        <w:tcMar>
+                          <w:top w:type="dxa" w:w="0"/>
+                          <w:left w:type="dxa" w:w="30"/>
+                          <w:bottom w:type="dxa" w:w="0"/>
+                          <w:right w:type="dxa" w:w="30"/>
+                        </w:tcMar>
+                      </w:tcPr>
+                      <w:p>
+                        <w:pPr>
+                          <w:spacing w:after="0" w:line="250"/>
+                          <w:jc w:val="center"/>
+                        </w:pPr>
+                        <w:r>
+                          <w:rPr>
+                            <w:rFonts w:ascii="Consolas" w:cs="Consolas" w:eastAsia="Consolas" w:hAnsi="Consolas"/>
+                            <w:b/>
+                            <w:bCs/>
+                            <w:color w:val="1A1A1A"/>
+                            <w:sz w:val="26"/>
+                            <w:szCs w:val="26"/>
+                          </w:rPr>
+                          <w:t xml:space="preserve">   </w:t>
+                        </w:r>
+                      </w:p>
+                    </w:tc>
+                  </w:tr>
+                  <w:tr>
+                    <w:tc>
+                      <w:tcPr>
+                        <w:tcW w:type="dxa" w:w="520"/>
+                        <w:tcBorders>
+                          <w:top w:val="none" w:color="FFFFFF" w:sz="0"/>
+                          <w:left w:val="dashed" w:color="9AA3B5" w:sz="6"/>
+                          <w:bottom w:val="dashed" w:color="9AA3B5" w:sz="6"/>
+                          <w:right w:val="dashed" w:color="9AA3B5" w:sz="6"/>
+                        </w:tcBorders>
+                        <w:tcMar>
+                          <w:top w:type="dxa" w:w="0"/>
+                          <w:left w:type="dxa" w:w="30"/>
+                          <w:bottom w:type="dxa" w:w="0"/>
+                          <w:right w:type="dxa" w:w="30"/>
+                        </w:tcMar>
+                      </w:tcPr>
+                      <w:p>
+                        <w:pPr>
+                          <w:spacing w:after="0" w:line="250"/>
+                          <w:jc w:val="center"/>
+                        </w:pPr>
+                        <w:r>
+                          <w:rPr>
+                            <w:rFonts w:ascii="Consolas" w:cs="Consolas" w:eastAsia="Consolas" w:hAnsi="Consolas"/>
+                            <w:b/>
+                            <w:bCs/>
+                            <w:color w:val="1A1A1A"/>
+                            <w:sz w:val="26"/>
+                            <w:szCs w:val="26"/>
+                          </w:rPr>
+                          <w:t xml:space="preserve">   </w:t>
+                        </w:r>
+                      </w:p>
+                    </w:tc>
+                  </w:tr>
+                </w:tbl>
+                <w:p/>
+              </w:tc>
+            </w:tr>
+          </w:tbl>
           <w:p>
             <w:pPr>
-              <w:spacing w:after="60" w:line="300"/>
+              <w:spacing w:after="0" w:line="40" w:lineRule="exact"/>
             </w:pPr>
-            <w:r>
-              <w:rPr>
-                <w:rFonts w:ascii="Consolas" w:cs="Consolas" w:eastAsia="Consolas" w:hAnsi="Consolas"/>
-                <w:color w:val="1A1A1A"/>
-                <w:sz w:val="22"/>
-                <w:szCs w:val="22"/>
-              </w:rPr>
-              <w:t xml:space="preserve">1/4 = ____/____        1/6 = ____/____</w:t>
-            </w:r>
           </w:p>
+          <w:tbl>
+            <w:tblPr>
+              <w:tblW w:type="dxa" w:w="7190"/>
+              <w:jc w:val="left"/>
+              <w:tblBorders>
+                <w:top w:val="single" w:color="auto" w:sz="4"/>
+                <w:left w:val="single" w:color="auto" w:sz="4"/>
+                <w:bottom w:val="single" w:color="auto" w:sz="4"/>
+                <w:right w:val="single" w:color="auto" w:sz="4"/>
+                <w:insideH w:val="single" w:color="auto" w:sz="4"/>
+                <w:insideV w:val="single" w:color="auto" w:sz="4"/>
+              </w:tblBorders>
+            </w:tblPr>
+            <w:tblGrid>
+              <w:gridCol w:w="5300"/>
+              <w:gridCol w:w="1150"/>
+              <w:gridCol w:w="740"/>
+            </w:tblGrid>
+            <w:tr>
+              <w:tc>
+                <w:tcPr>
+                  <w:tcW w:type="dxa" w:w="5300"/>
+                  <w:tcBorders>
+                    <w:top w:val="none" w:color="FFFFFF" w:sz="0"/>
+                    <w:left w:val="none" w:color="FFFFFF" w:sz="0"/>
+                    <w:bottom w:val="none" w:color="FFFFFF" w:sz="0"/>
+                    <w:right w:val="none" w:color="FFFFFF" w:sz="0"/>
+                  </w:tcBorders>
+                  <w:tcMar>
+                    <w:top w:type="dxa" w:w="30"/>
+                    <w:left w:type="dxa" w:w="20"/>
+                    <w:bottom w:type="dxa" w:w="30"/>
+                    <w:right w:type="dxa" w:w="20"/>
+                  </w:tcMar>
+                  <w:vAlign w:val="center"/>
+                </w:tcPr>
+                <w:p>
+                  <w:pPr>
+                    <w:spacing w:after="0"/>
+                  </w:pPr>
+                  <w:r>
+                    <w:rPr>
+                      <w:rFonts w:ascii="Consolas" w:cs="Consolas" w:eastAsia="Consolas" w:hAnsi="Consolas"/>
+                      <w:color w:val="1A1A1A"/>
+                      <w:sz w:val="22"/>
+                      <w:szCs w:val="22"/>
+                    </w:rPr>
+                    <w:t xml:space="preserve">Add the tops:  ____ + ____ = ____</w:t>
+                  </w:r>
+                </w:p>
+              </w:tc>
+              <w:tc>
+                <w:tcPr>
+                  <w:tcW w:type="dxa" w:w="1150"/>
+                  <w:tcBorders>
+                    <w:top w:val="none" w:color="FFFFFF" w:sz="0"/>
+                    <w:left w:val="none" w:color="FFFFFF" w:sz="0"/>
+                    <w:bottom w:val="none" w:color="FFFFFF" w:sz="0"/>
+                    <w:right w:val="none" w:color="FFFFFF" w:sz="0"/>
+                  </w:tcBorders>
+                  <w:tcMar>
+                    <w:top w:type="dxa" w:w="30"/>
+                    <w:left w:type="dxa" w:w="20"/>
+                    <w:bottom w:type="dxa" w:w="30"/>
+                    <w:right w:type="dxa" w:w="20"/>
+                  </w:tcMar>
+                  <w:vAlign w:val="center"/>
+                </w:tcPr>
+                <w:p>
+                  <w:pPr>
+                    <w:spacing w:after="0"/>
+                  </w:pPr>
+                  <w:r>
+                    <w:rPr>
+                      <w:rFonts w:ascii="Consolas" w:cs="Consolas" w:eastAsia="Consolas" w:hAnsi="Consolas"/>
+                      <w:color w:val="1A1A1A"/>
+                      <w:sz w:val="22"/>
+                      <w:szCs w:val="22"/>
+                    </w:rPr>
+                    <w:t xml:space="preserve">Answer:</w:t>
+                  </w:r>
+                </w:p>
+              </w:tc>
+              <w:tc>
+                <w:tcPr>
+                  <w:tcW w:type="dxa" w:w="740"/>
+                  <w:tcBorders>
+                    <w:top w:val="none" w:color="FFFFFF" w:sz="0"/>
+                    <w:left w:val="none" w:color="FFFFFF" w:sz="0"/>
+                    <w:bottom w:val="none" w:color="FFFFFF" w:sz="0"/>
+                    <w:right w:val="none" w:color="FFFFFF" w:sz="0"/>
+                  </w:tcBorders>
+                  <w:tcMar>
+                    <w:top w:type="dxa" w:w="30"/>
+                    <w:left w:type="dxa" w:w="20"/>
+                    <w:bottom w:type="dxa" w:w="30"/>
+                    <w:right w:type="dxa" w:w="20"/>
+                  </w:tcMar>
+                  <w:vAlign w:val="center"/>
+                </w:tcPr>
+                <w:tbl>
+                  <w:tblPr>
+                    <w:tblW w:type="dxa" w:w="640"/>
+                    <w:jc w:val="center"/>
+                    <w:tblBorders>
+                      <w:top w:val="single" w:color="auto" w:sz="4"/>
+                      <w:left w:val="single" w:color="auto" w:sz="4"/>
+                      <w:bottom w:val="single" w:color="auto" w:sz="4"/>
+                      <w:right w:val="single" w:color="auto" w:sz="4"/>
+                      <w:insideH w:val="none" w:color="FFFFFF" w:sz="0"/>
+                      <w:insideV w:val="single" w:color="auto" w:sz="4"/>
+                    </w:tblBorders>
+                  </w:tblPr>
+                  <w:tblGrid>
+                    <w:gridCol w:w="640"/>
+                  </w:tblGrid>
+                  <w:tr>
+                    <w:tc>
+                      <w:tcPr>
+                        <w:tcW w:type="dxa" w:w="520"/>
+                        <w:tcBorders>
+                          <w:top w:val="dashed" w:color="9AA3B5" w:sz="6"/>
+                          <w:left w:val="dashed" w:color="9AA3B5" w:sz="6"/>
+                          <w:bottom w:val="single" w:color="1A1A1A" w:sz="8"/>
+                          <w:right w:val="dashed" w:color="9AA3B5" w:sz="6"/>
+                        </w:tcBorders>
+                        <w:tcMar>
+                          <w:top w:type="dxa" w:w="0"/>
+                          <w:left w:type="dxa" w:w="30"/>
+                          <w:bottom w:type="dxa" w:w="0"/>
+                          <w:right w:type="dxa" w:w="30"/>
+                        </w:tcMar>
+                      </w:tcPr>
+                      <w:p>
+                        <w:pPr>
+                          <w:spacing w:after="0" w:line="250"/>
+                          <w:jc w:val="center"/>
+                        </w:pPr>
+                        <w:r>
+                          <w:rPr>
+                            <w:rFonts w:ascii="Consolas" w:cs="Consolas" w:eastAsia="Consolas" w:hAnsi="Consolas"/>
+                            <w:b/>
+                            <w:bCs/>
+                            <w:color w:val="1A1A1A"/>
+                            <w:sz w:val="26"/>
+                            <w:szCs w:val="26"/>
+                          </w:rPr>
+                          <w:t xml:space="preserve">   </w:t>
+                        </w:r>
+                      </w:p>
+                    </w:tc>
+                  </w:tr>
+                  <w:tr>
+                    <w:tc>
+                      <w:tcPr>
+                        <w:tcW w:type="dxa" w:w="520"/>
+                        <w:tcBorders>
+                          <w:top w:val="none" w:color="FFFFFF" w:sz="0"/>
+                          <w:left w:val="dashed" w:color="9AA3B5" w:sz="6"/>
+                          <w:bottom w:val="dashed" w:color="9AA3B5" w:sz="6"/>
+                          <w:right w:val="dashed" w:color="9AA3B5" w:sz="6"/>
+                        </w:tcBorders>
+                        <w:tcMar>
+                          <w:top w:type="dxa" w:w="0"/>
+                          <w:left w:type="dxa" w:w="30"/>
+                          <w:bottom w:type="dxa" w:w="0"/>
+                          <w:right w:type="dxa" w:w="30"/>
+                        </w:tcMar>
+                      </w:tcPr>
+                      <w:p>
+                        <w:pPr>
+                          <w:spacing w:after="0" w:line="250"/>
+                          <w:jc w:val="center"/>
+                        </w:pPr>
+                        <w:r>
+                          <w:rPr>
+                            <w:rFonts w:ascii="Consolas" w:cs="Consolas" w:eastAsia="Consolas" w:hAnsi="Consolas"/>
+                            <w:b/>
+                            <w:bCs/>
+                            <w:color w:val="1A1A1A"/>
+                            <w:sz w:val="26"/>
+                            <w:szCs w:val="26"/>
+                          </w:rPr>
+                          <w:t xml:space="preserve">   </w:t>
+                        </w:r>
+                      </w:p>
+                    </w:tc>
+                  </w:tr>
+                </w:tbl>
+                <w:p/>
+              </w:tc>
+            </w:tr>
+          </w:tbl>
           <w:p>
             <w:pPr>
-              <w:spacing w:after="60" w:line="300"/>
+              <w:spacing w:after="0" w:line="120" w:lineRule="exact"/>
             </w:pPr>
-            <w:r>
-              <w:rPr>
-                <w:rFonts w:ascii="Consolas" w:cs="Consolas" w:eastAsia="Consolas" w:hAnsi="Consolas"/>
-                <w:color w:val="1A1A1A"/>
-                <w:sz w:val="22"/>
-                <w:szCs w:val="22"/>
-              </w:rPr>
-              <w:t xml:space="preserve">Add the tops:  ____ + ____ = ____      Answer: ______</w:t>
-            </w:r>
           </w:p>
         </w:tc>
       </w:tr>
@@ -1375,6 +2147,9 @@
         <w:gridCol w:w="9360"/>
       </w:tblGrid>
       <w:tr>
+        <w:trPr>
+          <w:cantSplit/>
+        </w:trPr>
         <w:tc>
           <w:tcPr>
             <w:tcW w:type="dxa" w:w="9360"/>
@@ -1394,7 +2169,7 @@
           </w:tcPr>
           <w:tbl>
             <w:tblPr>
-              <w:tblW w:type="dxa" w:w="1920"/>
+              <w:tblW w:type="dxa" w:w="6220"/>
               <w:jc w:val="left"/>
               <w:tblBorders>
                 <w:top w:val="single" w:color="auto" w:sz="4"/>
@@ -1409,6 +2184,8 @@
               <w:gridCol w:w="700"/>
               <w:gridCol w:w="520"/>
               <w:gridCol w:w="700"/>
+              <w:gridCol w:w="500"/>
+              <w:gridCol w:w="3800"/>
             </w:tblGrid>
             <w:tr>
               <w:tc>
@@ -1549,7 +2326,7 @@
                       <w:sz w:val="26"/>
                       <w:szCs w:val="26"/>
                     </w:rPr>
-                    <w:t xml:space="preserve">-</w:t>
+                    <w:t xml:space="preserve">−</w:t>
                   </w:r>
                 </w:p>
               </w:tc>
@@ -1661,49 +2438,810 @@
                 </w:tbl>
                 <w:p/>
               </w:tc>
+              <w:tc>
+                <w:tcPr>
+                  <w:tcW w:type="dxa" w:w="500"/>
+                  <w:tcBorders>
+                    <w:top w:val="none" w:color="FFFFFF" w:sz="0"/>
+                    <w:left w:val="none" w:color="FFFFFF" w:sz="0"/>
+                    <w:bottom w:val="none" w:color="FFFFFF" w:sz="0"/>
+                    <w:right w:val="none" w:color="FFFFFF" w:sz="0"/>
+                  </w:tcBorders>
+                  <w:tcMar>
+                    <w:top w:type="dxa" w:w="30"/>
+                    <w:left w:type="dxa" w:w="20"/>
+                    <w:bottom w:type="dxa" w:w="30"/>
+                    <w:right w:type="dxa" w:w="20"/>
+                  </w:tcMar>
+                  <w:vAlign w:val="center"/>
+                </w:tcPr>
+                <w:p/>
+              </w:tc>
+              <w:tc>
+                <w:tcPr>
+                  <w:tcW w:type="dxa" w:w="3800"/>
+                  <w:tcBorders>
+                    <w:top w:val="none" w:color="FFFFFF" w:sz="0"/>
+                    <w:left w:val="none" w:color="FFFFFF" w:sz="0"/>
+                    <w:bottom w:val="none" w:color="FFFFFF" w:sz="0"/>
+                    <w:right w:val="none" w:color="FFFFFF" w:sz="0"/>
+                  </w:tcBorders>
+                  <w:tcMar>
+                    <w:top w:type="dxa" w:w="30"/>
+                    <w:left w:type="dxa" w:w="20"/>
+                    <w:bottom w:type="dxa" w:w="30"/>
+                    <w:right w:type="dxa" w:w="20"/>
+                  </w:tcMar>
+                  <w:vAlign w:val="center"/>
+                </w:tcPr>
+                <w:p>
+                  <w:pPr>
+                    <w:spacing w:after="0"/>
+                  </w:pPr>
+                  <w:r>
+                    <w:rPr>
+                      <w:rFonts w:ascii="Consolas" w:cs="Consolas" w:eastAsia="Consolas" w:hAnsi="Consolas"/>
+                      <w:color w:val="1A1A1A"/>
+                      <w:sz w:val="22"/>
+                      <w:szCs w:val="22"/>
+                    </w:rPr>
+                    <w:t xml:space="preserve">Common denominator: ______</w:t>
+                  </w:r>
+                </w:p>
+              </w:tc>
             </w:tr>
           </w:tbl>
           <w:p>
             <w:pPr>
-              <w:spacing w:after="60" w:line="300"/>
+              <w:spacing w:after="0" w:line="40" w:lineRule="exact"/>
             </w:pPr>
-            <w:r>
-              <w:rPr>
-                <w:rFonts w:ascii="Consolas" w:cs="Consolas" w:eastAsia="Consolas" w:hAnsi="Consolas"/>
-                <w:color w:val="1A1A1A"/>
-                <w:sz w:val="22"/>
-                <w:szCs w:val="22"/>
-              </w:rPr>
-              <w:t xml:space="preserve">Common denominator of 6 and 4:  ______</w:t>
-            </w:r>
           </w:p>
+          <w:tbl>
+            <w:tblPr>
+              <w:tblW w:type="dxa" w:w="4620"/>
+              <w:jc w:val="left"/>
+              <w:tblBorders>
+                <w:top w:val="single" w:color="auto" w:sz="4"/>
+                <w:left w:val="single" w:color="auto" w:sz="4"/>
+                <w:bottom w:val="single" w:color="auto" w:sz="4"/>
+                <w:right w:val="single" w:color="auto" w:sz="4"/>
+                <w:insideH w:val="single" w:color="auto" w:sz="4"/>
+                <w:insideV w:val="single" w:color="auto" w:sz="4"/>
+              </w:tblBorders>
+            </w:tblPr>
+            <w:tblGrid>
+              <w:gridCol w:w="700"/>
+              <w:gridCol w:w="520"/>
+              <w:gridCol w:w="740"/>
+              <w:gridCol w:w="700"/>
+              <w:gridCol w:w="700"/>
+              <w:gridCol w:w="520"/>
+              <w:gridCol w:w="740"/>
+            </w:tblGrid>
+            <w:tr>
+              <w:tc>
+                <w:tcPr>
+                  <w:tcW w:type="dxa" w:w="700"/>
+                  <w:tcBorders>
+                    <w:top w:val="none" w:color="FFFFFF" w:sz="0"/>
+                    <w:left w:val="none" w:color="FFFFFF" w:sz="0"/>
+                    <w:bottom w:val="none" w:color="FFFFFF" w:sz="0"/>
+                    <w:right w:val="none" w:color="FFFFFF" w:sz="0"/>
+                  </w:tcBorders>
+                  <w:tcMar>
+                    <w:top w:type="dxa" w:w="30"/>
+                    <w:left w:type="dxa" w:w="20"/>
+                    <w:bottom w:type="dxa" w:w="30"/>
+                    <w:right w:type="dxa" w:w="20"/>
+                  </w:tcMar>
+                  <w:vAlign w:val="center"/>
+                </w:tcPr>
+                <w:tbl>
+                  <w:tblPr>
+                    <w:tblW w:type="dxa" w:w="600"/>
+                    <w:jc w:val="center"/>
+                    <w:tblBorders>
+                      <w:top w:val="single" w:color="auto" w:sz="4"/>
+                      <w:left w:val="single" w:color="auto" w:sz="4"/>
+                      <w:bottom w:val="single" w:color="auto" w:sz="4"/>
+                      <w:right w:val="single" w:color="auto" w:sz="4"/>
+                      <w:insideH w:val="none" w:color="FFFFFF" w:sz="0"/>
+                      <w:insideV w:val="single" w:color="auto" w:sz="4"/>
+                    </w:tblBorders>
+                  </w:tblPr>
+                  <w:tblGrid>
+                    <w:gridCol w:w="600"/>
+                  </w:tblGrid>
+                  <w:tr>
+                    <w:tc>
+                      <w:tcPr>
+                        <w:tcW w:type="dxa" w:w="520"/>
+                        <w:tcBorders>
+                          <w:top w:val="none" w:color="FFFFFF" w:sz="0"/>
+                          <w:left w:val="none" w:color="FFFFFF" w:sz="0"/>
+                          <w:bottom w:val="single" w:color="1A1A1A" w:sz="8"/>
+                          <w:right w:val="none" w:color="FFFFFF" w:sz="0"/>
+                        </w:tcBorders>
+                        <w:tcMar>
+                          <w:top w:type="dxa" w:w="0"/>
+                          <w:left w:type="dxa" w:w="30"/>
+                          <w:bottom w:type="dxa" w:w="0"/>
+                          <w:right w:type="dxa" w:w="30"/>
+                        </w:tcMar>
+                      </w:tcPr>
+                      <w:p>
+                        <w:pPr>
+                          <w:spacing w:after="0" w:line="230"/>
+                          <w:jc w:val="center"/>
+                        </w:pPr>
+                        <w:r>
+                          <w:rPr>
+                            <w:rFonts w:ascii="Consolas" w:cs="Consolas" w:eastAsia="Consolas" w:hAnsi="Consolas"/>
+                            <w:b/>
+                            <w:bCs/>
+                            <w:color w:val="1A1A1A"/>
+                            <w:sz w:val="26"/>
+                            <w:szCs w:val="26"/>
+                          </w:rPr>
+                          <w:t xml:space="preserve">5</w:t>
+                        </w:r>
+                      </w:p>
+                    </w:tc>
+                  </w:tr>
+                  <w:tr>
+                    <w:tc>
+                      <w:tcPr>
+                        <w:tcW w:type="dxa" w:w="520"/>
+                        <w:tcBorders>
+                          <w:top w:val="none" w:color="FFFFFF" w:sz="0"/>
+                          <w:left w:val="none" w:color="FFFFFF" w:sz="0"/>
+                          <w:bottom w:val="none" w:color="FFFFFF" w:sz="0"/>
+                          <w:right w:val="none" w:color="FFFFFF" w:sz="0"/>
+                        </w:tcBorders>
+                        <w:tcMar>
+                          <w:top w:type="dxa" w:w="0"/>
+                          <w:left w:type="dxa" w:w="30"/>
+                          <w:bottom w:type="dxa" w:w="0"/>
+                          <w:right w:type="dxa" w:w="30"/>
+                        </w:tcMar>
+                      </w:tcPr>
+                      <w:p>
+                        <w:pPr>
+                          <w:spacing w:after="0" w:line="230"/>
+                          <w:jc w:val="center"/>
+                        </w:pPr>
+                        <w:r>
+                          <w:rPr>
+                            <w:rFonts w:ascii="Consolas" w:cs="Consolas" w:eastAsia="Consolas" w:hAnsi="Consolas"/>
+                            <w:b/>
+                            <w:bCs/>
+                            <w:color w:val="1A1A1A"/>
+                            <w:sz w:val="26"/>
+                            <w:szCs w:val="26"/>
+                          </w:rPr>
+                          <w:t xml:space="preserve">6</w:t>
+                        </w:r>
+                      </w:p>
+                    </w:tc>
+                  </w:tr>
+                </w:tbl>
+                <w:p/>
+              </w:tc>
+              <w:tc>
+                <w:tcPr>
+                  <w:tcW w:type="dxa" w:w="520"/>
+                  <w:tcBorders>
+                    <w:top w:val="none" w:color="FFFFFF" w:sz="0"/>
+                    <w:left w:val="none" w:color="FFFFFF" w:sz="0"/>
+                    <w:bottom w:val="none" w:color="FFFFFF" w:sz="0"/>
+                    <w:right w:val="none" w:color="FFFFFF" w:sz="0"/>
+                  </w:tcBorders>
+                  <w:tcMar>
+                    <w:top w:type="dxa" w:w="30"/>
+                    <w:left w:type="dxa" w:w="10"/>
+                    <w:bottom w:type="dxa" w:w="30"/>
+                    <w:right w:type="dxa" w:w="10"/>
+                  </w:tcMar>
+                  <w:vAlign w:val="center"/>
+                </w:tcPr>
+                <w:p>
+                  <w:pPr>
+                    <w:jc w:val="center"/>
+                  </w:pPr>
+                  <w:r>
+                    <w:rPr>
+                      <w:rFonts w:ascii="Consolas" w:cs="Consolas" w:eastAsia="Consolas" w:hAnsi="Consolas"/>
+                      <w:b/>
+                      <w:bCs/>
+                      <w:color w:val="7A86A8"/>
+                      <w:sz w:val="26"/>
+                      <w:szCs w:val="26"/>
+                    </w:rPr>
+                    <w:t xml:space="preserve">=</w:t>
+                  </w:r>
+                </w:p>
+              </w:tc>
+              <w:tc>
+                <w:tcPr>
+                  <w:tcW w:type="dxa" w:w="740"/>
+                  <w:tcBorders>
+                    <w:top w:val="none" w:color="FFFFFF" w:sz="0"/>
+                    <w:left w:val="none" w:color="FFFFFF" w:sz="0"/>
+                    <w:bottom w:val="none" w:color="FFFFFF" w:sz="0"/>
+                    <w:right w:val="none" w:color="FFFFFF" w:sz="0"/>
+                  </w:tcBorders>
+                  <w:tcMar>
+                    <w:top w:type="dxa" w:w="30"/>
+                    <w:left w:type="dxa" w:w="20"/>
+                    <w:bottom w:type="dxa" w:w="30"/>
+                    <w:right w:type="dxa" w:w="20"/>
+                  </w:tcMar>
+                  <w:vAlign w:val="center"/>
+                </w:tcPr>
+                <w:tbl>
+                  <w:tblPr>
+                    <w:tblW w:type="dxa" w:w="640"/>
+                    <w:jc w:val="center"/>
+                    <w:tblBorders>
+                      <w:top w:val="single" w:color="auto" w:sz="4"/>
+                      <w:left w:val="single" w:color="auto" w:sz="4"/>
+                      <w:bottom w:val="single" w:color="auto" w:sz="4"/>
+                      <w:right w:val="single" w:color="auto" w:sz="4"/>
+                      <w:insideH w:val="none" w:color="FFFFFF" w:sz="0"/>
+                      <w:insideV w:val="single" w:color="auto" w:sz="4"/>
+                    </w:tblBorders>
+                  </w:tblPr>
+                  <w:tblGrid>
+                    <w:gridCol w:w="640"/>
+                  </w:tblGrid>
+                  <w:tr>
+                    <w:tc>
+                      <w:tcPr>
+                        <w:tcW w:type="dxa" w:w="520"/>
+                        <w:tcBorders>
+                          <w:top w:val="dashed" w:color="9AA3B5" w:sz="6"/>
+                          <w:left w:val="dashed" w:color="9AA3B5" w:sz="6"/>
+                          <w:bottom w:val="single" w:color="1A1A1A" w:sz="8"/>
+                          <w:right w:val="dashed" w:color="9AA3B5" w:sz="6"/>
+                        </w:tcBorders>
+                        <w:tcMar>
+                          <w:top w:type="dxa" w:w="0"/>
+                          <w:left w:type="dxa" w:w="30"/>
+                          <w:bottom w:type="dxa" w:w="0"/>
+                          <w:right w:type="dxa" w:w="30"/>
+                        </w:tcMar>
+                      </w:tcPr>
+                      <w:p>
+                        <w:pPr>
+                          <w:spacing w:after="0" w:line="250"/>
+                          <w:jc w:val="center"/>
+                        </w:pPr>
+                        <w:r>
+                          <w:rPr>
+                            <w:rFonts w:ascii="Consolas" w:cs="Consolas" w:eastAsia="Consolas" w:hAnsi="Consolas"/>
+                            <w:b/>
+                            <w:bCs/>
+                            <w:color w:val="1A1A1A"/>
+                            <w:sz w:val="26"/>
+                            <w:szCs w:val="26"/>
+                          </w:rPr>
+                          <w:t xml:space="preserve">   </w:t>
+                        </w:r>
+                      </w:p>
+                    </w:tc>
+                  </w:tr>
+                  <w:tr>
+                    <w:tc>
+                      <w:tcPr>
+                        <w:tcW w:type="dxa" w:w="520"/>
+                        <w:tcBorders>
+                          <w:top w:val="none" w:color="FFFFFF" w:sz="0"/>
+                          <w:left w:val="dashed" w:color="9AA3B5" w:sz="6"/>
+                          <w:bottom w:val="dashed" w:color="9AA3B5" w:sz="6"/>
+                          <w:right w:val="dashed" w:color="9AA3B5" w:sz="6"/>
+                        </w:tcBorders>
+                        <w:tcMar>
+                          <w:top w:type="dxa" w:w="0"/>
+                          <w:left w:type="dxa" w:w="30"/>
+                          <w:bottom w:type="dxa" w:w="0"/>
+                          <w:right w:type="dxa" w:w="30"/>
+                        </w:tcMar>
+                      </w:tcPr>
+                      <w:p>
+                        <w:pPr>
+                          <w:spacing w:after="0" w:line="250"/>
+                          <w:jc w:val="center"/>
+                        </w:pPr>
+                        <w:r>
+                          <w:rPr>
+                            <w:rFonts w:ascii="Consolas" w:cs="Consolas" w:eastAsia="Consolas" w:hAnsi="Consolas"/>
+                            <w:b/>
+                            <w:bCs/>
+                            <w:color w:val="1A1A1A"/>
+                            <w:sz w:val="26"/>
+                            <w:szCs w:val="26"/>
+                          </w:rPr>
+                          <w:t xml:space="preserve">   </w:t>
+                        </w:r>
+                      </w:p>
+                    </w:tc>
+                  </w:tr>
+                </w:tbl>
+                <w:p/>
+              </w:tc>
+              <w:tc>
+                <w:tcPr>
+                  <w:tcW w:type="dxa" w:w="700"/>
+                  <w:tcBorders>
+                    <w:top w:val="none" w:color="FFFFFF" w:sz="0"/>
+                    <w:left w:val="none" w:color="FFFFFF" w:sz="0"/>
+                    <w:bottom w:val="none" w:color="FFFFFF" w:sz="0"/>
+                    <w:right w:val="none" w:color="FFFFFF" w:sz="0"/>
+                  </w:tcBorders>
+                  <w:tcMar>
+                    <w:top w:type="dxa" w:w="30"/>
+                    <w:left w:type="dxa" w:w="20"/>
+                    <w:bottom w:type="dxa" w:w="30"/>
+                    <w:right w:type="dxa" w:w="20"/>
+                  </w:tcMar>
+                  <w:vAlign w:val="center"/>
+                </w:tcPr>
+                <w:p/>
+              </w:tc>
+              <w:tc>
+                <w:tcPr>
+                  <w:tcW w:type="dxa" w:w="700"/>
+                  <w:tcBorders>
+                    <w:top w:val="none" w:color="FFFFFF" w:sz="0"/>
+                    <w:left w:val="none" w:color="FFFFFF" w:sz="0"/>
+                    <w:bottom w:val="none" w:color="FFFFFF" w:sz="0"/>
+                    <w:right w:val="none" w:color="FFFFFF" w:sz="0"/>
+                  </w:tcBorders>
+                  <w:tcMar>
+                    <w:top w:type="dxa" w:w="30"/>
+                    <w:left w:type="dxa" w:w="20"/>
+                    <w:bottom w:type="dxa" w:w="30"/>
+                    <w:right w:type="dxa" w:w="20"/>
+                  </w:tcMar>
+                  <w:vAlign w:val="center"/>
+                </w:tcPr>
+                <w:tbl>
+                  <w:tblPr>
+                    <w:tblW w:type="dxa" w:w="600"/>
+                    <w:jc w:val="center"/>
+                    <w:tblBorders>
+                      <w:top w:val="single" w:color="auto" w:sz="4"/>
+                      <w:left w:val="single" w:color="auto" w:sz="4"/>
+                      <w:bottom w:val="single" w:color="auto" w:sz="4"/>
+                      <w:right w:val="single" w:color="auto" w:sz="4"/>
+                      <w:insideH w:val="none" w:color="FFFFFF" w:sz="0"/>
+                      <w:insideV w:val="single" w:color="auto" w:sz="4"/>
+                    </w:tblBorders>
+                  </w:tblPr>
+                  <w:tblGrid>
+                    <w:gridCol w:w="600"/>
+                  </w:tblGrid>
+                  <w:tr>
+                    <w:tc>
+                      <w:tcPr>
+                        <w:tcW w:type="dxa" w:w="520"/>
+                        <w:tcBorders>
+                          <w:top w:val="none" w:color="FFFFFF" w:sz="0"/>
+                          <w:left w:val="none" w:color="FFFFFF" w:sz="0"/>
+                          <w:bottom w:val="single" w:color="1A1A1A" w:sz="8"/>
+                          <w:right w:val="none" w:color="FFFFFF" w:sz="0"/>
+                        </w:tcBorders>
+                        <w:tcMar>
+                          <w:top w:type="dxa" w:w="0"/>
+                          <w:left w:type="dxa" w:w="30"/>
+                          <w:bottom w:type="dxa" w:w="0"/>
+                          <w:right w:type="dxa" w:w="30"/>
+                        </w:tcMar>
+                      </w:tcPr>
+                      <w:p>
+                        <w:pPr>
+                          <w:spacing w:after="0" w:line="230"/>
+                          <w:jc w:val="center"/>
+                        </w:pPr>
+                        <w:r>
+                          <w:rPr>
+                            <w:rFonts w:ascii="Consolas" w:cs="Consolas" w:eastAsia="Consolas" w:hAnsi="Consolas"/>
+                            <w:b/>
+                            <w:bCs/>
+                            <w:color w:val="1A1A1A"/>
+                            <w:sz w:val="26"/>
+                            <w:szCs w:val="26"/>
+                          </w:rPr>
+                          <w:t xml:space="preserve">1</w:t>
+                        </w:r>
+                      </w:p>
+                    </w:tc>
+                  </w:tr>
+                  <w:tr>
+                    <w:tc>
+                      <w:tcPr>
+                        <w:tcW w:type="dxa" w:w="520"/>
+                        <w:tcBorders>
+                          <w:top w:val="none" w:color="FFFFFF" w:sz="0"/>
+                          <w:left w:val="none" w:color="FFFFFF" w:sz="0"/>
+                          <w:bottom w:val="none" w:color="FFFFFF" w:sz="0"/>
+                          <w:right w:val="none" w:color="FFFFFF" w:sz="0"/>
+                        </w:tcBorders>
+                        <w:tcMar>
+                          <w:top w:type="dxa" w:w="0"/>
+                          <w:left w:type="dxa" w:w="30"/>
+                          <w:bottom w:type="dxa" w:w="0"/>
+                          <w:right w:type="dxa" w:w="30"/>
+                        </w:tcMar>
+                      </w:tcPr>
+                      <w:p>
+                        <w:pPr>
+                          <w:spacing w:after="0" w:line="230"/>
+                          <w:jc w:val="center"/>
+                        </w:pPr>
+                        <w:r>
+                          <w:rPr>
+                            <w:rFonts w:ascii="Consolas" w:cs="Consolas" w:eastAsia="Consolas" w:hAnsi="Consolas"/>
+                            <w:b/>
+                            <w:bCs/>
+                            <w:color w:val="1A1A1A"/>
+                            <w:sz w:val="26"/>
+                            <w:szCs w:val="26"/>
+                          </w:rPr>
+                          <w:t xml:space="preserve">4</w:t>
+                        </w:r>
+                      </w:p>
+                    </w:tc>
+                  </w:tr>
+                </w:tbl>
+                <w:p/>
+              </w:tc>
+              <w:tc>
+                <w:tcPr>
+                  <w:tcW w:type="dxa" w:w="520"/>
+                  <w:tcBorders>
+                    <w:top w:val="none" w:color="FFFFFF" w:sz="0"/>
+                    <w:left w:val="none" w:color="FFFFFF" w:sz="0"/>
+                    <w:bottom w:val="none" w:color="FFFFFF" w:sz="0"/>
+                    <w:right w:val="none" w:color="FFFFFF" w:sz="0"/>
+                  </w:tcBorders>
+                  <w:tcMar>
+                    <w:top w:type="dxa" w:w="30"/>
+                    <w:left w:type="dxa" w:w="10"/>
+                    <w:bottom w:type="dxa" w:w="30"/>
+                    <w:right w:type="dxa" w:w="10"/>
+                  </w:tcMar>
+                  <w:vAlign w:val="center"/>
+                </w:tcPr>
+                <w:p>
+                  <w:pPr>
+                    <w:jc w:val="center"/>
+                  </w:pPr>
+                  <w:r>
+                    <w:rPr>
+                      <w:rFonts w:ascii="Consolas" w:cs="Consolas" w:eastAsia="Consolas" w:hAnsi="Consolas"/>
+                      <w:b/>
+                      <w:bCs/>
+                      <w:color w:val="7A86A8"/>
+                      <w:sz w:val="26"/>
+                      <w:szCs w:val="26"/>
+                    </w:rPr>
+                    <w:t xml:space="preserve">=</w:t>
+                  </w:r>
+                </w:p>
+              </w:tc>
+              <w:tc>
+                <w:tcPr>
+                  <w:tcW w:type="dxa" w:w="740"/>
+                  <w:tcBorders>
+                    <w:top w:val="none" w:color="FFFFFF" w:sz="0"/>
+                    <w:left w:val="none" w:color="FFFFFF" w:sz="0"/>
+                    <w:bottom w:val="none" w:color="FFFFFF" w:sz="0"/>
+                    <w:right w:val="none" w:color="FFFFFF" w:sz="0"/>
+                  </w:tcBorders>
+                  <w:tcMar>
+                    <w:top w:type="dxa" w:w="30"/>
+                    <w:left w:type="dxa" w:w="20"/>
+                    <w:bottom w:type="dxa" w:w="30"/>
+                    <w:right w:type="dxa" w:w="20"/>
+                  </w:tcMar>
+                  <w:vAlign w:val="center"/>
+                </w:tcPr>
+                <w:tbl>
+                  <w:tblPr>
+                    <w:tblW w:type="dxa" w:w="640"/>
+                    <w:jc w:val="center"/>
+                    <w:tblBorders>
+                      <w:top w:val="single" w:color="auto" w:sz="4"/>
+                      <w:left w:val="single" w:color="auto" w:sz="4"/>
+                      <w:bottom w:val="single" w:color="auto" w:sz="4"/>
+                      <w:right w:val="single" w:color="auto" w:sz="4"/>
+                      <w:insideH w:val="none" w:color="FFFFFF" w:sz="0"/>
+                      <w:insideV w:val="single" w:color="auto" w:sz="4"/>
+                    </w:tblBorders>
+                  </w:tblPr>
+                  <w:tblGrid>
+                    <w:gridCol w:w="640"/>
+                  </w:tblGrid>
+                  <w:tr>
+                    <w:tc>
+                      <w:tcPr>
+                        <w:tcW w:type="dxa" w:w="520"/>
+                        <w:tcBorders>
+                          <w:top w:val="dashed" w:color="9AA3B5" w:sz="6"/>
+                          <w:left w:val="dashed" w:color="9AA3B5" w:sz="6"/>
+                          <w:bottom w:val="single" w:color="1A1A1A" w:sz="8"/>
+                          <w:right w:val="dashed" w:color="9AA3B5" w:sz="6"/>
+                        </w:tcBorders>
+                        <w:tcMar>
+                          <w:top w:type="dxa" w:w="0"/>
+                          <w:left w:type="dxa" w:w="30"/>
+                          <w:bottom w:type="dxa" w:w="0"/>
+                          <w:right w:type="dxa" w:w="30"/>
+                        </w:tcMar>
+                      </w:tcPr>
+                      <w:p>
+                        <w:pPr>
+                          <w:spacing w:after="0" w:line="250"/>
+                          <w:jc w:val="center"/>
+                        </w:pPr>
+                        <w:r>
+                          <w:rPr>
+                            <w:rFonts w:ascii="Consolas" w:cs="Consolas" w:eastAsia="Consolas" w:hAnsi="Consolas"/>
+                            <w:b/>
+                            <w:bCs/>
+                            <w:color w:val="1A1A1A"/>
+                            <w:sz w:val="26"/>
+                            <w:szCs w:val="26"/>
+                          </w:rPr>
+                          <w:t xml:space="preserve">   </w:t>
+                        </w:r>
+                      </w:p>
+                    </w:tc>
+                  </w:tr>
+                  <w:tr>
+                    <w:tc>
+                      <w:tcPr>
+                        <w:tcW w:type="dxa" w:w="520"/>
+                        <w:tcBorders>
+                          <w:top w:val="none" w:color="FFFFFF" w:sz="0"/>
+                          <w:left w:val="dashed" w:color="9AA3B5" w:sz="6"/>
+                          <w:bottom w:val="dashed" w:color="9AA3B5" w:sz="6"/>
+                          <w:right w:val="dashed" w:color="9AA3B5" w:sz="6"/>
+                        </w:tcBorders>
+                        <w:tcMar>
+                          <w:top w:type="dxa" w:w="0"/>
+                          <w:left w:type="dxa" w:w="30"/>
+                          <w:bottom w:type="dxa" w:w="0"/>
+                          <w:right w:type="dxa" w:w="30"/>
+                        </w:tcMar>
+                      </w:tcPr>
+                      <w:p>
+                        <w:pPr>
+                          <w:spacing w:after="0" w:line="250"/>
+                          <w:jc w:val="center"/>
+                        </w:pPr>
+                        <w:r>
+                          <w:rPr>
+                            <w:rFonts w:ascii="Consolas" w:cs="Consolas" w:eastAsia="Consolas" w:hAnsi="Consolas"/>
+                            <w:b/>
+                            <w:bCs/>
+                            <w:color w:val="1A1A1A"/>
+                            <w:sz w:val="26"/>
+                            <w:szCs w:val="26"/>
+                          </w:rPr>
+                          <w:t xml:space="preserve">   </w:t>
+                        </w:r>
+                      </w:p>
+                    </w:tc>
+                  </w:tr>
+                </w:tbl>
+                <w:p/>
+              </w:tc>
+            </w:tr>
+          </w:tbl>
           <w:p>
             <w:pPr>
-              <w:spacing w:after="60" w:line="300"/>
+              <w:spacing w:after="0" w:line="40" w:lineRule="exact"/>
             </w:pPr>
-            <w:r>
-              <w:rPr>
-                <w:rFonts w:ascii="Consolas" w:cs="Consolas" w:eastAsia="Consolas" w:hAnsi="Consolas"/>
-                <w:color w:val="1A1A1A"/>
-                <w:sz w:val="22"/>
-                <w:szCs w:val="22"/>
-              </w:rPr>
-              <w:t xml:space="preserve">5/6 = ____/____        1/4 = ____/____</w:t>
-            </w:r>
           </w:p>
+          <w:tbl>
+            <w:tblPr>
+              <w:tblW w:type="dxa" w:w="7190"/>
+              <w:jc w:val="left"/>
+              <w:tblBorders>
+                <w:top w:val="single" w:color="auto" w:sz="4"/>
+                <w:left w:val="single" w:color="auto" w:sz="4"/>
+                <w:bottom w:val="single" w:color="auto" w:sz="4"/>
+                <w:right w:val="single" w:color="auto" w:sz="4"/>
+                <w:insideH w:val="single" w:color="auto" w:sz="4"/>
+                <w:insideV w:val="single" w:color="auto" w:sz="4"/>
+              </w:tblBorders>
+            </w:tblPr>
+            <w:tblGrid>
+              <w:gridCol w:w="5300"/>
+              <w:gridCol w:w="1150"/>
+              <w:gridCol w:w="740"/>
+            </w:tblGrid>
+            <w:tr>
+              <w:tc>
+                <w:tcPr>
+                  <w:tcW w:type="dxa" w:w="5300"/>
+                  <w:tcBorders>
+                    <w:top w:val="none" w:color="FFFFFF" w:sz="0"/>
+                    <w:left w:val="none" w:color="FFFFFF" w:sz="0"/>
+                    <w:bottom w:val="none" w:color="FFFFFF" w:sz="0"/>
+                    <w:right w:val="none" w:color="FFFFFF" w:sz="0"/>
+                  </w:tcBorders>
+                  <w:tcMar>
+                    <w:top w:type="dxa" w:w="30"/>
+                    <w:left w:type="dxa" w:w="20"/>
+                    <w:bottom w:type="dxa" w:w="30"/>
+                    <w:right w:type="dxa" w:w="20"/>
+                  </w:tcMar>
+                  <w:vAlign w:val="center"/>
+                </w:tcPr>
+                <w:p>
+                  <w:pPr>
+                    <w:spacing w:after="0"/>
+                  </w:pPr>
+                  <w:r>
+                    <w:rPr>
+                      <w:rFonts w:ascii="Consolas" w:cs="Consolas" w:eastAsia="Consolas" w:hAnsi="Consolas"/>
+                      <w:color w:val="1A1A1A"/>
+                      <w:sz w:val="22"/>
+                      <w:szCs w:val="22"/>
+                    </w:rPr>
+                    <w:t xml:space="preserve">Subtract the tops:  ____ − ____ = ____</w:t>
+                  </w:r>
+                </w:p>
+              </w:tc>
+              <w:tc>
+                <w:tcPr>
+                  <w:tcW w:type="dxa" w:w="1150"/>
+                  <w:tcBorders>
+                    <w:top w:val="none" w:color="FFFFFF" w:sz="0"/>
+                    <w:left w:val="none" w:color="FFFFFF" w:sz="0"/>
+                    <w:bottom w:val="none" w:color="FFFFFF" w:sz="0"/>
+                    <w:right w:val="none" w:color="FFFFFF" w:sz="0"/>
+                  </w:tcBorders>
+                  <w:tcMar>
+                    <w:top w:type="dxa" w:w="30"/>
+                    <w:left w:type="dxa" w:w="20"/>
+                    <w:bottom w:type="dxa" w:w="30"/>
+                    <w:right w:type="dxa" w:w="20"/>
+                  </w:tcMar>
+                  <w:vAlign w:val="center"/>
+                </w:tcPr>
+                <w:p>
+                  <w:pPr>
+                    <w:spacing w:after="0"/>
+                  </w:pPr>
+                  <w:r>
+                    <w:rPr>
+                      <w:rFonts w:ascii="Consolas" w:cs="Consolas" w:eastAsia="Consolas" w:hAnsi="Consolas"/>
+                      <w:color w:val="1A1A1A"/>
+                      <w:sz w:val="22"/>
+                      <w:szCs w:val="22"/>
+                    </w:rPr>
+                    <w:t xml:space="preserve">Answer:</w:t>
+                  </w:r>
+                </w:p>
+              </w:tc>
+              <w:tc>
+                <w:tcPr>
+                  <w:tcW w:type="dxa" w:w="740"/>
+                  <w:tcBorders>
+                    <w:top w:val="none" w:color="FFFFFF" w:sz="0"/>
+                    <w:left w:val="none" w:color="FFFFFF" w:sz="0"/>
+                    <w:bottom w:val="none" w:color="FFFFFF" w:sz="0"/>
+                    <w:right w:val="none" w:color="FFFFFF" w:sz="0"/>
+                  </w:tcBorders>
+                  <w:tcMar>
+                    <w:top w:type="dxa" w:w="30"/>
+                    <w:left w:type="dxa" w:w="20"/>
+                    <w:bottom w:type="dxa" w:w="30"/>
+                    <w:right w:type="dxa" w:w="20"/>
+                  </w:tcMar>
+                  <w:vAlign w:val="center"/>
+                </w:tcPr>
+                <w:tbl>
+                  <w:tblPr>
+                    <w:tblW w:type="dxa" w:w="640"/>
+                    <w:jc w:val="center"/>
+                    <w:tblBorders>
+                      <w:top w:val="single" w:color="auto" w:sz="4"/>
+                      <w:left w:val="single" w:color="auto" w:sz="4"/>
+                      <w:bottom w:val="single" w:color="auto" w:sz="4"/>
+                      <w:right w:val="single" w:color="auto" w:sz="4"/>
+                      <w:insideH w:val="none" w:color="FFFFFF" w:sz="0"/>
+                      <w:insideV w:val="single" w:color="auto" w:sz="4"/>
+                    </w:tblBorders>
+                  </w:tblPr>
+                  <w:tblGrid>
+                    <w:gridCol w:w="640"/>
+                  </w:tblGrid>
+                  <w:tr>
+                    <w:tc>
+                      <w:tcPr>
+                        <w:tcW w:type="dxa" w:w="520"/>
+                        <w:tcBorders>
+                          <w:top w:val="dashed" w:color="9AA3B5" w:sz="6"/>
+                          <w:left w:val="dashed" w:color="9AA3B5" w:sz="6"/>
+                          <w:bottom w:val="single" w:color="1A1A1A" w:sz="8"/>
+                          <w:right w:val="dashed" w:color="9AA3B5" w:sz="6"/>
+                        </w:tcBorders>
+                        <w:tcMar>
+                          <w:top w:type="dxa" w:w="0"/>
+                          <w:left w:type="dxa" w:w="30"/>
+                          <w:bottom w:type="dxa" w:w="0"/>
+                          <w:right w:type="dxa" w:w="30"/>
+                        </w:tcMar>
+                      </w:tcPr>
+                      <w:p>
+                        <w:pPr>
+                          <w:spacing w:after="0" w:line="250"/>
+                          <w:jc w:val="center"/>
+                        </w:pPr>
+                        <w:r>
+                          <w:rPr>
+                            <w:rFonts w:ascii="Consolas" w:cs="Consolas" w:eastAsia="Consolas" w:hAnsi="Consolas"/>
+                            <w:b/>
+                            <w:bCs/>
+                            <w:color w:val="1A1A1A"/>
+                            <w:sz w:val="26"/>
+                            <w:szCs w:val="26"/>
+                          </w:rPr>
+                          <w:t xml:space="preserve">   </w:t>
+                        </w:r>
+                      </w:p>
+                    </w:tc>
+                  </w:tr>
+                  <w:tr>
+                    <w:tc>
+                      <w:tcPr>
+                        <w:tcW w:type="dxa" w:w="520"/>
+                        <w:tcBorders>
+                          <w:top w:val="none" w:color="FFFFFF" w:sz="0"/>
+                          <w:left w:val="dashed" w:color="9AA3B5" w:sz="6"/>
+                          <w:bottom w:val="dashed" w:color="9AA3B5" w:sz="6"/>
+                          <w:right w:val="dashed" w:color="9AA3B5" w:sz="6"/>
+                        </w:tcBorders>
+                        <w:tcMar>
+                          <w:top w:type="dxa" w:w="0"/>
+                          <w:left w:type="dxa" w:w="30"/>
+                          <w:bottom w:type="dxa" w:w="0"/>
+                          <w:right w:type="dxa" w:w="30"/>
+                        </w:tcMar>
+                      </w:tcPr>
+                      <w:p>
+                        <w:pPr>
+                          <w:spacing w:after="0" w:line="250"/>
+                          <w:jc w:val="center"/>
+                        </w:pPr>
+                        <w:r>
+                          <w:rPr>
+                            <w:rFonts w:ascii="Consolas" w:cs="Consolas" w:eastAsia="Consolas" w:hAnsi="Consolas"/>
+                            <w:b/>
+                            <w:bCs/>
+                            <w:color w:val="1A1A1A"/>
+                            <w:sz w:val="26"/>
+                            <w:szCs w:val="26"/>
+                          </w:rPr>
+                          <w:t xml:space="preserve">   </w:t>
+                        </w:r>
+                      </w:p>
+                    </w:tc>
+                  </w:tr>
+                </w:tbl>
+                <w:p/>
+              </w:tc>
+            </w:tr>
+          </w:tbl>
           <w:p>
             <w:pPr>
-              <w:spacing w:after="60" w:line="300"/>
+              <w:spacing w:after="0" w:line="120" w:lineRule="exact"/>
             </w:pPr>
-            <w:r>
-              <w:rPr>
-                <w:rFonts w:ascii="Consolas" w:cs="Consolas" w:eastAsia="Consolas" w:hAnsi="Consolas"/>
-                <w:color w:val="1A1A1A"/>
-                <w:sz w:val="22"/>
-                <w:szCs w:val="22"/>
-              </w:rPr>
-              <w:t xml:space="preserve">Subtract the tops:  ____ − ____ = ____      Answer: ______</w:t>
-            </w:r>
           </w:p>
         </w:tc>
       </w:tr>
@@ -1739,6 +3277,9 @@
         <w:gridCol w:w="9360"/>
       </w:tblGrid>
       <w:tr>
+        <w:trPr>
+          <w:cantSplit/>
+        </w:trPr>
         <w:tc>
           <w:tcPr>
             <w:tcW w:type="dxa" w:w="9360"/>
@@ -1758,7 +3299,7 @@
           </w:tcPr>
           <w:tbl>
             <w:tblPr>
-              <w:tblW w:type="dxa" w:w="1920"/>
+              <w:tblW w:type="dxa" w:w="6220"/>
               <w:jc w:val="left"/>
               <w:tblBorders>
                 <w:top w:val="single" w:color="auto" w:sz="4"/>
@@ -1773,6 +3314,8 @@
               <w:gridCol w:w="700"/>
               <w:gridCol w:w="520"/>
               <w:gridCol w:w="700"/>
+              <w:gridCol w:w="500"/>
+              <w:gridCol w:w="3800"/>
             </w:tblGrid>
             <w:tr>
               <w:tc>
@@ -2025,49 +3568,810 @@
                 </w:tbl>
                 <w:p/>
               </w:tc>
+              <w:tc>
+                <w:tcPr>
+                  <w:tcW w:type="dxa" w:w="500"/>
+                  <w:tcBorders>
+                    <w:top w:val="none" w:color="FFFFFF" w:sz="0"/>
+                    <w:left w:val="none" w:color="FFFFFF" w:sz="0"/>
+                    <w:bottom w:val="none" w:color="FFFFFF" w:sz="0"/>
+                    <w:right w:val="none" w:color="FFFFFF" w:sz="0"/>
+                  </w:tcBorders>
+                  <w:tcMar>
+                    <w:top w:type="dxa" w:w="30"/>
+                    <w:left w:type="dxa" w:w="20"/>
+                    <w:bottom w:type="dxa" w:w="30"/>
+                    <w:right w:type="dxa" w:w="20"/>
+                  </w:tcMar>
+                  <w:vAlign w:val="center"/>
+                </w:tcPr>
+                <w:p/>
+              </w:tc>
+              <w:tc>
+                <w:tcPr>
+                  <w:tcW w:type="dxa" w:w="3800"/>
+                  <w:tcBorders>
+                    <w:top w:val="none" w:color="FFFFFF" w:sz="0"/>
+                    <w:left w:val="none" w:color="FFFFFF" w:sz="0"/>
+                    <w:bottom w:val="none" w:color="FFFFFF" w:sz="0"/>
+                    <w:right w:val="none" w:color="FFFFFF" w:sz="0"/>
+                  </w:tcBorders>
+                  <w:tcMar>
+                    <w:top w:type="dxa" w:w="30"/>
+                    <w:left w:type="dxa" w:w="20"/>
+                    <w:bottom w:type="dxa" w:w="30"/>
+                    <w:right w:type="dxa" w:w="20"/>
+                  </w:tcMar>
+                  <w:vAlign w:val="center"/>
+                </w:tcPr>
+                <w:p>
+                  <w:pPr>
+                    <w:spacing w:after="0"/>
+                  </w:pPr>
+                  <w:r>
+                    <w:rPr>
+                      <w:rFonts w:ascii="Consolas" w:cs="Consolas" w:eastAsia="Consolas" w:hAnsi="Consolas"/>
+                      <w:color w:val="1A1A1A"/>
+                      <w:sz w:val="22"/>
+                      <w:szCs w:val="22"/>
+                    </w:rPr>
+                    <w:t xml:space="preserve">Common denominator: ______</w:t>
+                  </w:r>
+                </w:p>
+              </w:tc>
             </w:tr>
           </w:tbl>
           <w:p>
             <w:pPr>
-              <w:spacing w:after="60" w:line="300"/>
+              <w:spacing w:after="0" w:line="40" w:lineRule="exact"/>
             </w:pPr>
-            <w:r>
-              <w:rPr>
-                <w:rFonts w:ascii="Consolas" w:cs="Consolas" w:eastAsia="Consolas" w:hAnsi="Consolas"/>
-                <w:color w:val="1A1A1A"/>
-                <w:sz w:val="22"/>
-                <w:szCs w:val="22"/>
-              </w:rPr>
-              <w:t xml:space="preserve">Common denominator of 3 and 5:  ______</w:t>
-            </w:r>
           </w:p>
+          <w:tbl>
+            <w:tblPr>
+              <w:tblW w:type="dxa" w:w="4620"/>
+              <w:jc w:val="left"/>
+              <w:tblBorders>
+                <w:top w:val="single" w:color="auto" w:sz="4"/>
+                <w:left w:val="single" w:color="auto" w:sz="4"/>
+                <w:bottom w:val="single" w:color="auto" w:sz="4"/>
+                <w:right w:val="single" w:color="auto" w:sz="4"/>
+                <w:insideH w:val="single" w:color="auto" w:sz="4"/>
+                <w:insideV w:val="single" w:color="auto" w:sz="4"/>
+              </w:tblBorders>
+            </w:tblPr>
+            <w:tblGrid>
+              <w:gridCol w:w="700"/>
+              <w:gridCol w:w="520"/>
+              <w:gridCol w:w="740"/>
+              <w:gridCol w:w="700"/>
+              <w:gridCol w:w="700"/>
+              <w:gridCol w:w="520"/>
+              <w:gridCol w:w="740"/>
+            </w:tblGrid>
+            <w:tr>
+              <w:tc>
+                <w:tcPr>
+                  <w:tcW w:type="dxa" w:w="700"/>
+                  <w:tcBorders>
+                    <w:top w:val="none" w:color="FFFFFF" w:sz="0"/>
+                    <w:left w:val="none" w:color="FFFFFF" w:sz="0"/>
+                    <w:bottom w:val="none" w:color="FFFFFF" w:sz="0"/>
+                    <w:right w:val="none" w:color="FFFFFF" w:sz="0"/>
+                  </w:tcBorders>
+                  <w:tcMar>
+                    <w:top w:type="dxa" w:w="30"/>
+                    <w:left w:type="dxa" w:w="20"/>
+                    <w:bottom w:type="dxa" w:w="30"/>
+                    <w:right w:type="dxa" w:w="20"/>
+                  </w:tcMar>
+                  <w:vAlign w:val="center"/>
+                </w:tcPr>
+                <w:tbl>
+                  <w:tblPr>
+                    <w:tblW w:type="dxa" w:w="600"/>
+                    <w:jc w:val="center"/>
+                    <w:tblBorders>
+                      <w:top w:val="single" w:color="auto" w:sz="4"/>
+                      <w:left w:val="single" w:color="auto" w:sz="4"/>
+                      <w:bottom w:val="single" w:color="auto" w:sz="4"/>
+                      <w:right w:val="single" w:color="auto" w:sz="4"/>
+                      <w:insideH w:val="none" w:color="FFFFFF" w:sz="0"/>
+                      <w:insideV w:val="single" w:color="auto" w:sz="4"/>
+                    </w:tblBorders>
+                  </w:tblPr>
+                  <w:tblGrid>
+                    <w:gridCol w:w="600"/>
+                  </w:tblGrid>
+                  <w:tr>
+                    <w:tc>
+                      <w:tcPr>
+                        <w:tcW w:type="dxa" w:w="520"/>
+                        <w:tcBorders>
+                          <w:top w:val="none" w:color="FFFFFF" w:sz="0"/>
+                          <w:left w:val="none" w:color="FFFFFF" w:sz="0"/>
+                          <w:bottom w:val="single" w:color="1A1A1A" w:sz="8"/>
+                          <w:right w:val="none" w:color="FFFFFF" w:sz="0"/>
+                        </w:tcBorders>
+                        <w:tcMar>
+                          <w:top w:type="dxa" w:w="0"/>
+                          <w:left w:type="dxa" w:w="30"/>
+                          <w:bottom w:type="dxa" w:w="0"/>
+                          <w:right w:type="dxa" w:w="30"/>
+                        </w:tcMar>
+                      </w:tcPr>
+                      <w:p>
+                        <w:pPr>
+                          <w:spacing w:after="0" w:line="230"/>
+                          <w:jc w:val="center"/>
+                        </w:pPr>
+                        <w:r>
+                          <w:rPr>
+                            <w:rFonts w:ascii="Consolas" w:cs="Consolas" w:eastAsia="Consolas" w:hAnsi="Consolas"/>
+                            <w:b/>
+                            <w:bCs/>
+                            <w:color w:val="1A1A1A"/>
+                            <w:sz w:val="26"/>
+                            <w:szCs w:val="26"/>
+                          </w:rPr>
+                          <w:t xml:space="preserve">2</w:t>
+                        </w:r>
+                      </w:p>
+                    </w:tc>
+                  </w:tr>
+                  <w:tr>
+                    <w:tc>
+                      <w:tcPr>
+                        <w:tcW w:type="dxa" w:w="520"/>
+                        <w:tcBorders>
+                          <w:top w:val="none" w:color="FFFFFF" w:sz="0"/>
+                          <w:left w:val="none" w:color="FFFFFF" w:sz="0"/>
+                          <w:bottom w:val="none" w:color="FFFFFF" w:sz="0"/>
+                          <w:right w:val="none" w:color="FFFFFF" w:sz="0"/>
+                        </w:tcBorders>
+                        <w:tcMar>
+                          <w:top w:type="dxa" w:w="0"/>
+                          <w:left w:type="dxa" w:w="30"/>
+                          <w:bottom w:type="dxa" w:w="0"/>
+                          <w:right w:type="dxa" w:w="30"/>
+                        </w:tcMar>
+                      </w:tcPr>
+                      <w:p>
+                        <w:pPr>
+                          <w:spacing w:after="0" w:line="230"/>
+                          <w:jc w:val="center"/>
+                        </w:pPr>
+                        <w:r>
+                          <w:rPr>
+                            <w:rFonts w:ascii="Consolas" w:cs="Consolas" w:eastAsia="Consolas" w:hAnsi="Consolas"/>
+                            <w:b/>
+                            <w:bCs/>
+                            <w:color w:val="1A1A1A"/>
+                            <w:sz w:val="26"/>
+                            <w:szCs w:val="26"/>
+                          </w:rPr>
+                          <w:t xml:space="preserve">3</w:t>
+                        </w:r>
+                      </w:p>
+                    </w:tc>
+                  </w:tr>
+                </w:tbl>
+                <w:p/>
+              </w:tc>
+              <w:tc>
+                <w:tcPr>
+                  <w:tcW w:type="dxa" w:w="520"/>
+                  <w:tcBorders>
+                    <w:top w:val="none" w:color="FFFFFF" w:sz="0"/>
+                    <w:left w:val="none" w:color="FFFFFF" w:sz="0"/>
+                    <w:bottom w:val="none" w:color="FFFFFF" w:sz="0"/>
+                    <w:right w:val="none" w:color="FFFFFF" w:sz="0"/>
+                  </w:tcBorders>
+                  <w:tcMar>
+                    <w:top w:type="dxa" w:w="30"/>
+                    <w:left w:type="dxa" w:w="10"/>
+                    <w:bottom w:type="dxa" w:w="30"/>
+                    <w:right w:type="dxa" w:w="10"/>
+                  </w:tcMar>
+                  <w:vAlign w:val="center"/>
+                </w:tcPr>
+                <w:p>
+                  <w:pPr>
+                    <w:jc w:val="center"/>
+                  </w:pPr>
+                  <w:r>
+                    <w:rPr>
+                      <w:rFonts w:ascii="Consolas" w:cs="Consolas" w:eastAsia="Consolas" w:hAnsi="Consolas"/>
+                      <w:b/>
+                      <w:bCs/>
+                      <w:color w:val="7A86A8"/>
+                      <w:sz w:val="26"/>
+                      <w:szCs w:val="26"/>
+                    </w:rPr>
+                    <w:t xml:space="preserve">=</w:t>
+                  </w:r>
+                </w:p>
+              </w:tc>
+              <w:tc>
+                <w:tcPr>
+                  <w:tcW w:type="dxa" w:w="740"/>
+                  <w:tcBorders>
+                    <w:top w:val="none" w:color="FFFFFF" w:sz="0"/>
+                    <w:left w:val="none" w:color="FFFFFF" w:sz="0"/>
+                    <w:bottom w:val="none" w:color="FFFFFF" w:sz="0"/>
+                    <w:right w:val="none" w:color="FFFFFF" w:sz="0"/>
+                  </w:tcBorders>
+                  <w:tcMar>
+                    <w:top w:type="dxa" w:w="30"/>
+                    <w:left w:type="dxa" w:w="20"/>
+                    <w:bottom w:type="dxa" w:w="30"/>
+                    <w:right w:type="dxa" w:w="20"/>
+                  </w:tcMar>
+                  <w:vAlign w:val="center"/>
+                </w:tcPr>
+                <w:tbl>
+                  <w:tblPr>
+                    <w:tblW w:type="dxa" w:w="640"/>
+                    <w:jc w:val="center"/>
+                    <w:tblBorders>
+                      <w:top w:val="single" w:color="auto" w:sz="4"/>
+                      <w:left w:val="single" w:color="auto" w:sz="4"/>
+                      <w:bottom w:val="single" w:color="auto" w:sz="4"/>
+                      <w:right w:val="single" w:color="auto" w:sz="4"/>
+                      <w:insideH w:val="none" w:color="FFFFFF" w:sz="0"/>
+                      <w:insideV w:val="single" w:color="auto" w:sz="4"/>
+                    </w:tblBorders>
+                  </w:tblPr>
+                  <w:tblGrid>
+                    <w:gridCol w:w="640"/>
+                  </w:tblGrid>
+                  <w:tr>
+                    <w:tc>
+                      <w:tcPr>
+                        <w:tcW w:type="dxa" w:w="520"/>
+                        <w:tcBorders>
+                          <w:top w:val="dashed" w:color="9AA3B5" w:sz="6"/>
+                          <w:left w:val="dashed" w:color="9AA3B5" w:sz="6"/>
+                          <w:bottom w:val="single" w:color="1A1A1A" w:sz="8"/>
+                          <w:right w:val="dashed" w:color="9AA3B5" w:sz="6"/>
+                        </w:tcBorders>
+                        <w:tcMar>
+                          <w:top w:type="dxa" w:w="0"/>
+                          <w:left w:type="dxa" w:w="30"/>
+                          <w:bottom w:type="dxa" w:w="0"/>
+                          <w:right w:type="dxa" w:w="30"/>
+                        </w:tcMar>
+                      </w:tcPr>
+                      <w:p>
+                        <w:pPr>
+                          <w:spacing w:after="0" w:line="250"/>
+                          <w:jc w:val="center"/>
+                        </w:pPr>
+                        <w:r>
+                          <w:rPr>
+                            <w:rFonts w:ascii="Consolas" w:cs="Consolas" w:eastAsia="Consolas" w:hAnsi="Consolas"/>
+                            <w:b/>
+                            <w:bCs/>
+                            <w:color w:val="1A1A1A"/>
+                            <w:sz w:val="26"/>
+                            <w:szCs w:val="26"/>
+                          </w:rPr>
+                          <w:t xml:space="preserve">   </w:t>
+                        </w:r>
+                      </w:p>
+                    </w:tc>
+                  </w:tr>
+                  <w:tr>
+                    <w:tc>
+                      <w:tcPr>
+                        <w:tcW w:type="dxa" w:w="520"/>
+                        <w:tcBorders>
+                          <w:top w:val="none" w:color="FFFFFF" w:sz="0"/>
+                          <w:left w:val="dashed" w:color="9AA3B5" w:sz="6"/>
+                          <w:bottom w:val="dashed" w:color="9AA3B5" w:sz="6"/>
+                          <w:right w:val="dashed" w:color="9AA3B5" w:sz="6"/>
+                        </w:tcBorders>
+                        <w:tcMar>
+                          <w:top w:type="dxa" w:w="0"/>
+                          <w:left w:type="dxa" w:w="30"/>
+                          <w:bottom w:type="dxa" w:w="0"/>
+                          <w:right w:type="dxa" w:w="30"/>
+                        </w:tcMar>
+                      </w:tcPr>
+                      <w:p>
+                        <w:pPr>
+                          <w:spacing w:after="0" w:line="250"/>
+                          <w:jc w:val="center"/>
+                        </w:pPr>
+                        <w:r>
+                          <w:rPr>
+                            <w:rFonts w:ascii="Consolas" w:cs="Consolas" w:eastAsia="Consolas" w:hAnsi="Consolas"/>
+                            <w:b/>
+                            <w:bCs/>
+                            <w:color w:val="1A1A1A"/>
+                            <w:sz w:val="26"/>
+                            <w:szCs w:val="26"/>
+                          </w:rPr>
+                          <w:t xml:space="preserve">   </w:t>
+                        </w:r>
+                      </w:p>
+                    </w:tc>
+                  </w:tr>
+                </w:tbl>
+                <w:p/>
+              </w:tc>
+              <w:tc>
+                <w:tcPr>
+                  <w:tcW w:type="dxa" w:w="700"/>
+                  <w:tcBorders>
+                    <w:top w:val="none" w:color="FFFFFF" w:sz="0"/>
+                    <w:left w:val="none" w:color="FFFFFF" w:sz="0"/>
+                    <w:bottom w:val="none" w:color="FFFFFF" w:sz="0"/>
+                    <w:right w:val="none" w:color="FFFFFF" w:sz="0"/>
+                  </w:tcBorders>
+                  <w:tcMar>
+                    <w:top w:type="dxa" w:w="30"/>
+                    <w:left w:type="dxa" w:w="20"/>
+                    <w:bottom w:type="dxa" w:w="30"/>
+                    <w:right w:type="dxa" w:w="20"/>
+                  </w:tcMar>
+                  <w:vAlign w:val="center"/>
+                </w:tcPr>
+                <w:p/>
+              </w:tc>
+              <w:tc>
+                <w:tcPr>
+                  <w:tcW w:type="dxa" w:w="700"/>
+                  <w:tcBorders>
+                    <w:top w:val="none" w:color="FFFFFF" w:sz="0"/>
+                    <w:left w:val="none" w:color="FFFFFF" w:sz="0"/>
+                    <w:bottom w:val="none" w:color="FFFFFF" w:sz="0"/>
+                    <w:right w:val="none" w:color="FFFFFF" w:sz="0"/>
+                  </w:tcBorders>
+                  <w:tcMar>
+                    <w:top w:type="dxa" w:w="30"/>
+                    <w:left w:type="dxa" w:w="20"/>
+                    <w:bottom w:type="dxa" w:w="30"/>
+                    <w:right w:type="dxa" w:w="20"/>
+                  </w:tcMar>
+                  <w:vAlign w:val="center"/>
+                </w:tcPr>
+                <w:tbl>
+                  <w:tblPr>
+                    <w:tblW w:type="dxa" w:w="600"/>
+                    <w:jc w:val="center"/>
+                    <w:tblBorders>
+                      <w:top w:val="single" w:color="auto" w:sz="4"/>
+                      <w:left w:val="single" w:color="auto" w:sz="4"/>
+                      <w:bottom w:val="single" w:color="auto" w:sz="4"/>
+                      <w:right w:val="single" w:color="auto" w:sz="4"/>
+                      <w:insideH w:val="none" w:color="FFFFFF" w:sz="0"/>
+                      <w:insideV w:val="single" w:color="auto" w:sz="4"/>
+                    </w:tblBorders>
+                  </w:tblPr>
+                  <w:tblGrid>
+                    <w:gridCol w:w="600"/>
+                  </w:tblGrid>
+                  <w:tr>
+                    <w:tc>
+                      <w:tcPr>
+                        <w:tcW w:type="dxa" w:w="520"/>
+                        <w:tcBorders>
+                          <w:top w:val="none" w:color="FFFFFF" w:sz="0"/>
+                          <w:left w:val="none" w:color="FFFFFF" w:sz="0"/>
+                          <w:bottom w:val="single" w:color="1A1A1A" w:sz="8"/>
+                          <w:right w:val="none" w:color="FFFFFF" w:sz="0"/>
+                        </w:tcBorders>
+                        <w:tcMar>
+                          <w:top w:type="dxa" w:w="0"/>
+                          <w:left w:type="dxa" w:w="30"/>
+                          <w:bottom w:type="dxa" w:w="0"/>
+                          <w:right w:type="dxa" w:w="30"/>
+                        </w:tcMar>
+                      </w:tcPr>
+                      <w:p>
+                        <w:pPr>
+                          <w:spacing w:after="0" w:line="230"/>
+                          <w:jc w:val="center"/>
+                        </w:pPr>
+                        <w:r>
+                          <w:rPr>
+                            <w:rFonts w:ascii="Consolas" w:cs="Consolas" w:eastAsia="Consolas" w:hAnsi="Consolas"/>
+                            <w:b/>
+                            <w:bCs/>
+                            <w:color w:val="1A1A1A"/>
+                            <w:sz w:val="26"/>
+                            <w:szCs w:val="26"/>
+                          </w:rPr>
+                          <w:t xml:space="preserve">3</w:t>
+                        </w:r>
+                      </w:p>
+                    </w:tc>
+                  </w:tr>
+                  <w:tr>
+                    <w:tc>
+                      <w:tcPr>
+                        <w:tcW w:type="dxa" w:w="520"/>
+                        <w:tcBorders>
+                          <w:top w:val="none" w:color="FFFFFF" w:sz="0"/>
+                          <w:left w:val="none" w:color="FFFFFF" w:sz="0"/>
+                          <w:bottom w:val="none" w:color="FFFFFF" w:sz="0"/>
+                          <w:right w:val="none" w:color="FFFFFF" w:sz="0"/>
+                        </w:tcBorders>
+                        <w:tcMar>
+                          <w:top w:type="dxa" w:w="0"/>
+                          <w:left w:type="dxa" w:w="30"/>
+                          <w:bottom w:type="dxa" w:w="0"/>
+                          <w:right w:type="dxa" w:w="30"/>
+                        </w:tcMar>
+                      </w:tcPr>
+                      <w:p>
+                        <w:pPr>
+                          <w:spacing w:after="0" w:line="230"/>
+                          <w:jc w:val="center"/>
+                        </w:pPr>
+                        <w:r>
+                          <w:rPr>
+                            <w:rFonts w:ascii="Consolas" w:cs="Consolas" w:eastAsia="Consolas" w:hAnsi="Consolas"/>
+                            <w:b/>
+                            <w:bCs/>
+                            <w:color w:val="1A1A1A"/>
+                            <w:sz w:val="26"/>
+                            <w:szCs w:val="26"/>
+                          </w:rPr>
+                          <w:t xml:space="preserve">5</w:t>
+                        </w:r>
+                      </w:p>
+                    </w:tc>
+                  </w:tr>
+                </w:tbl>
+                <w:p/>
+              </w:tc>
+              <w:tc>
+                <w:tcPr>
+                  <w:tcW w:type="dxa" w:w="520"/>
+                  <w:tcBorders>
+                    <w:top w:val="none" w:color="FFFFFF" w:sz="0"/>
+                    <w:left w:val="none" w:color="FFFFFF" w:sz="0"/>
+                    <w:bottom w:val="none" w:color="FFFFFF" w:sz="0"/>
+                    <w:right w:val="none" w:color="FFFFFF" w:sz="0"/>
+                  </w:tcBorders>
+                  <w:tcMar>
+                    <w:top w:type="dxa" w:w="30"/>
+                    <w:left w:type="dxa" w:w="10"/>
+                    <w:bottom w:type="dxa" w:w="30"/>
+                    <w:right w:type="dxa" w:w="10"/>
+                  </w:tcMar>
+                  <w:vAlign w:val="center"/>
+                </w:tcPr>
+                <w:p>
+                  <w:pPr>
+                    <w:jc w:val="center"/>
+                  </w:pPr>
+                  <w:r>
+                    <w:rPr>
+                      <w:rFonts w:ascii="Consolas" w:cs="Consolas" w:eastAsia="Consolas" w:hAnsi="Consolas"/>
+                      <w:b/>
+                      <w:bCs/>
+                      <w:color w:val="7A86A8"/>
+                      <w:sz w:val="26"/>
+                      <w:szCs w:val="26"/>
+                    </w:rPr>
+                    <w:t xml:space="preserve">=</w:t>
+                  </w:r>
+                </w:p>
+              </w:tc>
+              <w:tc>
+                <w:tcPr>
+                  <w:tcW w:type="dxa" w:w="740"/>
+                  <w:tcBorders>
+                    <w:top w:val="none" w:color="FFFFFF" w:sz="0"/>
+                    <w:left w:val="none" w:color="FFFFFF" w:sz="0"/>
+                    <w:bottom w:val="none" w:color="FFFFFF" w:sz="0"/>
+                    <w:right w:val="none" w:color="FFFFFF" w:sz="0"/>
+                  </w:tcBorders>
+                  <w:tcMar>
+                    <w:top w:type="dxa" w:w="30"/>
+                    <w:left w:type="dxa" w:w="20"/>
+                    <w:bottom w:type="dxa" w:w="30"/>
+                    <w:right w:type="dxa" w:w="20"/>
+                  </w:tcMar>
+                  <w:vAlign w:val="center"/>
+                </w:tcPr>
+                <w:tbl>
+                  <w:tblPr>
+                    <w:tblW w:type="dxa" w:w="640"/>
+                    <w:jc w:val="center"/>
+                    <w:tblBorders>
+                      <w:top w:val="single" w:color="auto" w:sz="4"/>
+                      <w:left w:val="single" w:color="auto" w:sz="4"/>
+                      <w:bottom w:val="single" w:color="auto" w:sz="4"/>
+                      <w:right w:val="single" w:color="auto" w:sz="4"/>
+                      <w:insideH w:val="none" w:color="FFFFFF" w:sz="0"/>
+                      <w:insideV w:val="single" w:color="auto" w:sz="4"/>
+                    </w:tblBorders>
+                  </w:tblPr>
+                  <w:tblGrid>
+                    <w:gridCol w:w="640"/>
+                  </w:tblGrid>
+                  <w:tr>
+                    <w:tc>
+                      <w:tcPr>
+                        <w:tcW w:type="dxa" w:w="520"/>
+                        <w:tcBorders>
+                          <w:top w:val="dashed" w:color="9AA3B5" w:sz="6"/>
+                          <w:left w:val="dashed" w:color="9AA3B5" w:sz="6"/>
+                          <w:bottom w:val="single" w:color="1A1A1A" w:sz="8"/>
+                          <w:right w:val="dashed" w:color="9AA3B5" w:sz="6"/>
+                        </w:tcBorders>
+                        <w:tcMar>
+                          <w:top w:type="dxa" w:w="0"/>
+                          <w:left w:type="dxa" w:w="30"/>
+                          <w:bottom w:type="dxa" w:w="0"/>
+                          <w:right w:type="dxa" w:w="30"/>
+                        </w:tcMar>
+                      </w:tcPr>
+                      <w:p>
+                        <w:pPr>
+                          <w:spacing w:after="0" w:line="250"/>
+                          <w:jc w:val="center"/>
+                        </w:pPr>
+                        <w:r>
+                          <w:rPr>
+                            <w:rFonts w:ascii="Consolas" w:cs="Consolas" w:eastAsia="Consolas" w:hAnsi="Consolas"/>
+                            <w:b/>
+                            <w:bCs/>
+                            <w:color w:val="1A1A1A"/>
+                            <w:sz w:val="26"/>
+                            <w:szCs w:val="26"/>
+                          </w:rPr>
+                          <w:t xml:space="preserve">   </w:t>
+                        </w:r>
+                      </w:p>
+                    </w:tc>
+                  </w:tr>
+                  <w:tr>
+                    <w:tc>
+                      <w:tcPr>
+                        <w:tcW w:type="dxa" w:w="520"/>
+                        <w:tcBorders>
+                          <w:top w:val="none" w:color="FFFFFF" w:sz="0"/>
+                          <w:left w:val="dashed" w:color="9AA3B5" w:sz="6"/>
+                          <w:bottom w:val="dashed" w:color="9AA3B5" w:sz="6"/>
+                          <w:right w:val="dashed" w:color="9AA3B5" w:sz="6"/>
+                        </w:tcBorders>
+                        <w:tcMar>
+                          <w:top w:type="dxa" w:w="0"/>
+                          <w:left w:type="dxa" w:w="30"/>
+                          <w:bottom w:type="dxa" w:w="0"/>
+                          <w:right w:type="dxa" w:w="30"/>
+                        </w:tcMar>
+                      </w:tcPr>
+                      <w:p>
+                        <w:pPr>
+                          <w:spacing w:after="0" w:line="250"/>
+                          <w:jc w:val="center"/>
+                        </w:pPr>
+                        <w:r>
+                          <w:rPr>
+                            <w:rFonts w:ascii="Consolas" w:cs="Consolas" w:eastAsia="Consolas" w:hAnsi="Consolas"/>
+                            <w:b/>
+                            <w:bCs/>
+                            <w:color w:val="1A1A1A"/>
+                            <w:sz w:val="26"/>
+                            <w:szCs w:val="26"/>
+                          </w:rPr>
+                          <w:t xml:space="preserve">   </w:t>
+                        </w:r>
+                      </w:p>
+                    </w:tc>
+                  </w:tr>
+                </w:tbl>
+                <w:p/>
+              </w:tc>
+            </w:tr>
+          </w:tbl>
           <w:p>
             <w:pPr>
-              <w:spacing w:after="60" w:line="300"/>
+              <w:spacing w:after="0" w:line="40" w:lineRule="exact"/>
             </w:pPr>
-            <w:r>
-              <w:rPr>
-                <w:rFonts w:ascii="Consolas" w:cs="Consolas" w:eastAsia="Consolas" w:hAnsi="Consolas"/>
-                <w:color w:val="1A1A1A"/>
-                <w:sz w:val="22"/>
-                <w:szCs w:val="22"/>
-              </w:rPr>
-              <w:t xml:space="preserve">2/3 = ____/____        3/5 = ____/____</w:t>
-            </w:r>
           </w:p>
+          <w:tbl>
+            <w:tblPr>
+              <w:tblW w:type="dxa" w:w="7190"/>
+              <w:jc w:val="left"/>
+              <w:tblBorders>
+                <w:top w:val="single" w:color="auto" w:sz="4"/>
+                <w:left w:val="single" w:color="auto" w:sz="4"/>
+                <w:bottom w:val="single" w:color="auto" w:sz="4"/>
+                <w:right w:val="single" w:color="auto" w:sz="4"/>
+                <w:insideH w:val="single" w:color="auto" w:sz="4"/>
+                <w:insideV w:val="single" w:color="auto" w:sz="4"/>
+              </w:tblBorders>
+            </w:tblPr>
+            <w:tblGrid>
+              <w:gridCol w:w="5300"/>
+              <w:gridCol w:w="1150"/>
+              <w:gridCol w:w="740"/>
+            </w:tblGrid>
+            <w:tr>
+              <w:tc>
+                <w:tcPr>
+                  <w:tcW w:type="dxa" w:w="5300"/>
+                  <w:tcBorders>
+                    <w:top w:val="none" w:color="FFFFFF" w:sz="0"/>
+                    <w:left w:val="none" w:color="FFFFFF" w:sz="0"/>
+                    <w:bottom w:val="none" w:color="FFFFFF" w:sz="0"/>
+                    <w:right w:val="none" w:color="FFFFFF" w:sz="0"/>
+                  </w:tcBorders>
+                  <w:tcMar>
+                    <w:top w:type="dxa" w:w="30"/>
+                    <w:left w:type="dxa" w:w="20"/>
+                    <w:bottom w:type="dxa" w:w="30"/>
+                    <w:right w:type="dxa" w:w="20"/>
+                  </w:tcMar>
+                  <w:vAlign w:val="center"/>
+                </w:tcPr>
+                <w:p>
+                  <w:pPr>
+                    <w:spacing w:after="0"/>
+                  </w:pPr>
+                  <w:r>
+                    <w:rPr>
+                      <w:rFonts w:ascii="Consolas" w:cs="Consolas" w:eastAsia="Consolas" w:hAnsi="Consolas"/>
+                      <w:color w:val="1A1A1A"/>
+                      <w:sz w:val="22"/>
+                      <w:szCs w:val="22"/>
+                    </w:rPr>
+                    <w:t xml:space="preserve">Add the tops:  ____ + ____ = ____</w:t>
+                  </w:r>
+                </w:p>
+              </w:tc>
+              <w:tc>
+                <w:tcPr>
+                  <w:tcW w:type="dxa" w:w="1150"/>
+                  <w:tcBorders>
+                    <w:top w:val="none" w:color="FFFFFF" w:sz="0"/>
+                    <w:left w:val="none" w:color="FFFFFF" w:sz="0"/>
+                    <w:bottom w:val="none" w:color="FFFFFF" w:sz="0"/>
+                    <w:right w:val="none" w:color="FFFFFF" w:sz="0"/>
+                  </w:tcBorders>
+                  <w:tcMar>
+                    <w:top w:type="dxa" w:w="30"/>
+                    <w:left w:type="dxa" w:w="20"/>
+                    <w:bottom w:type="dxa" w:w="30"/>
+                    <w:right w:type="dxa" w:w="20"/>
+                  </w:tcMar>
+                  <w:vAlign w:val="center"/>
+                </w:tcPr>
+                <w:p>
+                  <w:pPr>
+                    <w:spacing w:after="0"/>
+                  </w:pPr>
+                  <w:r>
+                    <w:rPr>
+                      <w:rFonts w:ascii="Consolas" w:cs="Consolas" w:eastAsia="Consolas" w:hAnsi="Consolas"/>
+                      <w:color w:val="1A1A1A"/>
+                      <w:sz w:val="22"/>
+                      <w:szCs w:val="22"/>
+                    </w:rPr>
+                    <w:t xml:space="preserve">Answer:</w:t>
+                  </w:r>
+                </w:p>
+              </w:tc>
+              <w:tc>
+                <w:tcPr>
+                  <w:tcW w:type="dxa" w:w="740"/>
+                  <w:tcBorders>
+                    <w:top w:val="none" w:color="FFFFFF" w:sz="0"/>
+                    <w:left w:val="none" w:color="FFFFFF" w:sz="0"/>
+                    <w:bottom w:val="none" w:color="FFFFFF" w:sz="0"/>
+                    <w:right w:val="none" w:color="FFFFFF" w:sz="0"/>
+                  </w:tcBorders>
+                  <w:tcMar>
+                    <w:top w:type="dxa" w:w="30"/>
+                    <w:left w:type="dxa" w:w="20"/>
+                    <w:bottom w:type="dxa" w:w="30"/>
+                    <w:right w:type="dxa" w:w="20"/>
+                  </w:tcMar>
+                  <w:vAlign w:val="center"/>
+                </w:tcPr>
+                <w:tbl>
+                  <w:tblPr>
+                    <w:tblW w:type="dxa" w:w="640"/>
+                    <w:jc w:val="center"/>
+                    <w:tblBorders>
+                      <w:top w:val="single" w:color="auto" w:sz="4"/>
+                      <w:left w:val="single" w:color="auto" w:sz="4"/>
+                      <w:bottom w:val="single" w:color="auto" w:sz="4"/>
+                      <w:right w:val="single" w:color="auto" w:sz="4"/>
+                      <w:insideH w:val="none" w:color="FFFFFF" w:sz="0"/>
+                      <w:insideV w:val="single" w:color="auto" w:sz="4"/>
+                    </w:tblBorders>
+                  </w:tblPr>
+                  <w:tblGrid>
+                    <w:gridCol w:w="640"/>
+                  </w:tblGrid>
+                  <w:tr>
+                    <w:tc>
+                      <w:tcPr>
+                        <w:tcW w:type="dxa" w:w="520"/>
+                        <w:tcBorders>
+                          <w:top w:val="dashed" w:color="9AA3B5" w:sz="6"/>
+                          <w:left w:val="dashed" w:color="9AA3B5" w:sz="6"/>
+                          <w:bottom w:val="single" w:color="1A1A1A" w:sz="8"/>
+                          <w:right w:val="dashed" w:color="9AA3B5" w:sz="6"/>
+                        </w:tcBorders>
+                        <w:tcMar>
+                          <w:top w:type="dxa" w:w="0"/>
+                          <w:left w:type="dxa" w:w="30"/>
+                          <w:bottom w:type="dxa" w:w="0"/>
+                          <w:right w:type="dxa" w:w="30"/>
+                        </w:tcMar>
+                      </w:tcPr>
+                      <w:p>
+                        <w:pPr>
+                          <w:spacing w:after="0" w:line="250"/>
+                          <w:jc w:val="center"/>
+                        </w:pPr>
+                        <w:r>
+                          <w:rPr>
+                            <w:rFonts w:ascii="Consolas" w:cs="Consolas" w:eastAsia="Consolas" w:hAnsi="Consolas"/>
+                            <w:b/>
+                            <w:bCs/>
+                            <w:color w:val="1A1A1A"/>
+                            <w:sz w:val="26"/>
+                            <w:szCs w:val="26"/>
+                          </w:rPr>
+                          <w:t xml:space="preserve">   </w:t>
+                        </w:r>
+                      </w:p>
+                    </w:tc>
+                  </w:tr>
+                  <w:tr>
+                    <w:tc>
+                      <w:tcPr>
+                        <w:tcW w:type="dxa" w:w="520"/>
+                        <w:tcBorders>
+                          <w:top w:val="none" w:color="FFFFFF" w:sz="0"/>
+                          <w:left w:val="dashed" w:color="9AA3B5" w:sz="6"/>
+                          <w:bottom w:val="dashed" w:color="9AA3B5" w:sz="6"/>
+                          <w:right w:val="dashed" w:color="9AA3B5" w:sz="6"/>
+                        </w:tcBorders>
+                        <w:tcMar>
+                          <w:top w:type="dxa" w:w="0"/>
+                          <w:left w:type="dxa" w:w="30"/>
+                          <w:bottom w:type="dxa" w:w="0"/>
+                          <w:right w:type="dxa" w:w="30"/>
+                        </w:tcMar>
+                      </w:tcPr>
+                      <w:p>
+                        <w:pPr>
+                          <w:spacing w:after="0" w:line="250"/>
+                          <w:jc w:val="center"/>
+                        </w:pPr>
+                        <w:r>
+                          <w:rPr>
+                            <w:rFonts w:ascii="Consolas" w:cs="Consolas" w:eastAsia="Consolas" w:hAnsi="Consolas"/>
+                            <w:b/>
+                            <w:bCs/>
+                            <w:color w:val="1A1A1A"/>
+                            <w:sz w:val="26"/>
+                            <w:szCs w:val="26"/>
+                          </w:rPr>
+                          <w:t xml:space="preserve">   </w:t>
+                        </w:r>
+                      </w:p>
+                    </w:tc>
+                  </w:tr>
+                </w:tbl>
+                <w:p/>
+              </w:tc>
+            </w:tr>
+          </w:tbl>
           <w:p>
             <w:pPr>
-              <w:spacing w:after="60" w:line="300"/>
+              <w:spacing w:after="0" w:line="120" w:lineRule="exact"/>
             </w:pPr>
-            <w:r>
-              <w:rPr>
-                <w:rFonts w:ascii="Consolas" w:cs="Consolas" w:eastAsia="Consolas" w:hAnsi="Consolas"/>
-                <w:color w:val="1A1A1A"/>
-                <w:sz w:val="22"/>
-                <w:szCs w:val="22"/>
-              </w:rPr>
-              <w:t xml:space="preserve">Add the tops:  ____ + ____ = ____      Answer: ______  (this one is more than 1)</w:t>
-            </w:r>
           </w:p>
         </w:tc>
       </w:tr>
@@ -2105,6 +4409,9 @@
         <w:gridCol w:w="4680"/>
       </w:tblGrid>
       <w:tr>
+        <w:trPr>
+          <w:cantSplit/>
+        </w:trPr>
         <w:tc>
           <w:tcPr>
             <w:tcW w:type="dxa" w:w="4680"/>
@@ -2138,7 +4445,7 @@
           </w:p>
           <w:tbl>
             <w:tblPr>
-              <w:tblW w:type="dxa" w:w="2960"/>
+              <w:tblW w:type="dxa" w:w="3180"/>
               <w:jc w:val="left"/>
               <w:tblBorders>
                 <w:top w:val="single" w:color="auto" w:sz="4"/>
@@ -2154,7 +4461,7 @@
               <w:gridCol w:w="520"/>
               <w:gridCol w:w="700"/>
               <w:gridCol w:w="520"/>
-              <w:gridCol w:w="520"/>
+              <w:gridCol w:w="740"/>
             </w:tblGrid>
             <w:tr>
               <w:tc>
@@ -2443,36 +4750,111 @@
               </w:tc>
               <w:tc>
                 <w:tcPr>
-                  <w:tcW w:type="dxa" w:w="520"/>
-                  <w:tcBorders>
-                    <w:top w:val="none" w:color="FFFFFF" w:sz="0"/>
-                    <w:left w:val="none" w:color="FFFFFF" w:sz="0"/>
-                    <w:bottom w:val="none" w:color="FFFFFF" w:sz="0"/>
-                    <w:right w:val="none" w:color="FFFFFF" w:sz="0"/>
-                  </w:tcBorders>
-                  <w:tcMar>
-                    <w:top w:type="dxa" w:w="30"/>
-                    <w:left w:type="dxa" w:w="10"/>
-                    <w:bottom w:type="dxa" w:w="30"/>
-                    <w:right w:type="dxa" w:w="10"/>
-                  </w:tcMar>
-                  <w:vAlign w:val="center"/>
-                </w:tcPr>
-                <w:p>
-                  <w:pPr>
+                  <w:tcW w:type="dxa" w:w="740"/>
+                  <w:tcBorders>
+                    <w:top w:val="none" w:color="FFFFFF" w:sz="0"/>
+                    <w:left w:val="none" w:color="FFFFFF" w:sz="0"/>
+                    <w:bottom w:val="none" w:color="FFFFFF" w:sz="0"/>
+                    <w:right w:val="none" w:color="FFFFFF" w:sz="0"/>
+                  </w:tcBorders>
+                  <w:tcMar>
+                    <w:top w:type="dxa" w:w="30"/>
+                    <w:left w:type="dxa" w:w="20"/>
+                    <w:bottom w:type="dxa" w:w="30"/>
+                    <w:right w:type="dxa" w:w="20"/>
+                  </w:tcMar>
+                  <w:vAlign w:val="center"/>
+                </w:tcPr>
+                <w:tbl>
+                  <w:tblPr>
+                    <w:tblW w:type="dxa" w:w="640"/>
                     <w:jc w:val="center"/>
-                  </w:pPr>
-                  <w:r>
-                    <w:rPr>
-                      <w:b/>
-                      <w:bCs/>
-                      <w:color w:val="1A1A1A"/>
-                      <w:sz w:val="22"/>
-                      <w:szCs w:val="22"/>
-                    </w:rPr>
-                    <w:t xml:space="preserve">______</w:t>
-                  </w:r>
-                </w:p>
+                    <w:tblBorders>
+                      <w:top w:val="single" w:color="auto" w:sz="4"/>
+                      <w:left w:val="single" w:color="auto" w:sz="4"/>
+                      <w:bottom w:val="single" w:color="auto" w:sz="4"/>
+                      <w:right w:val="single" w:color="auto" w:sz="4"/>
+                      <w:insideH w:val="none" w:color="FFFFFF" w:sz="0"/>
+                      <w:insideV w:val="single" w:color="auto" w:sz="4"/>
+                    </w:tblBorders>
+                  </w:tblPr>
+                  <w:tblGrid>
+                    <w:gridCol w:w="640"/>
+                  </w:tblGrid>
+                  <w:tr>
+                    <w:tc>
+                      <w:tcPr>
+                        <w:tcW w:type="dxa" w:w="520"/>
+                        <w:tcBorders>
+                          <w:top w:val="dashed" w:color="9AA3B5" w:sz="6"/>
+                          <w:left w:val="dashed" w:color="9AA3B5" w:sz="6"/>
+                          <w:bottom w:val="single" w:color="1A1A1A" w:sz="8"/>
+                          <w:right w:val="dashed" w:color="9AA3B5" w:sz="6"/>
+                        </w:tcBorders>
+                        <w:tcMar>
+                          <w:top w:type="dxa" w:w="0"/>
+                          <w:left w:type="dxa" w:w="30"/>
+                          <w:bottom w:type="dxa" w:w="0"/>
+                          <w:right w:type="dxa" w:w="30"/>
+                        </w:tcMar>
+                      </w:tcPr>
+                      <w:p>
+                        <w:pPr>
+                          <w:spacing w:after="0" w:line="250"/>
+                          <w:jc w:val="center"/>
+                        </w:pPr>
+                        <w:r>
+                          <w:rPr>
+                            <w:rFonts w:ascii="Consolas" w:cs="Consolas" w:eastAsia="Consolas" w:hAnsi="Consolas"/>
+                            <w:b/>
+                            <w:bCs/>
+                            <w:color w:val="1A1A1A"/>
+                            <w:sz w:val="26"/>
+                            <w:szCs w:val="26"/>
+                          </w:rPr>
+                          <w:t xml:space="preserve">   </w:t>
+                        </w:r>
+                      </w:p>
+                    </w:tc>
+                  </w:tr>
+                  <w:tr>
+                    <w:tc>
+                      <w:tcPr>
+                        <w:tcW w:type="dxa" w:w="520"/>
+                        <w:tcBorders>
+                          <w:top w:val="none" w:color="FFFFFF" w:sz="0"/>
+                          <w:left w:val="dashed" w:color="9AA3B5" w:sz="6"/>
+                          <w:bottom w:val="dashed" w:color="9AA3B5" w:sz="6"/>
+                          <w:right w:val="dashed" w:color="9AA3B5" w:sz="6"/>
+                        </w:tcBorders>
+                        <w:tcMar>
+                          <w:top w:type="dxa" w:w="0"/>
+                          <w:left w:type="dxa" w:w="30"/>
+                          <w:bottom w:type="dxa" w:w="0"/>
+                          <w:right w:type="dxa" w:w="30"/>
+                        </w:tcMar>
+                      </w:tcPr>
+                      <w:p>
+                        <w:pPr>
+                          <w:spacing w:after="0" w:line="250"/>
+                          <w:jc w:val="center"/>
+                        </w:pPr>
+                        <w:r>
+                          <w:rPr>
+                            <w:rFonts w:ascii="Consolas" w:cs="Consolas" w:eastAsia="Consolas" w:hAnsi="Consolas"/>
+                            <w:b/>
+                            <w:bCs/>
+                            <w:color w:val="1A1A1A"/>
+                            <w:sz w:val="26"/>
+                            <w:szCs w:val="26"/>
+                          </w:rPr>
+                          <w:t xml:space="preserve">   </w:t>
+                        </w:r>
+                      </w:p>
+                    </w:tc>
+                  </w:tr>
+                </w:tbl>
+                <w:p/>
               </w:tc>
             </w:tr>
           </w:tbl>
@@ -2511,7 +4893,7 @@
           </w:p>
           <w:tbl>
             <w:tblPr>
-              <w:tblW w:type="dxa" w:w="2960"/>
+              <w:tblW w:type="dxa" w:w="3180"/>
               <w:jc w:val="left"/>
               <w:tblBorders>
                 <w:top w:val="single" w:color="auto" w:sz="4"/>
@@ -2527,7 +4909,7 @@
               <w:gridCol w:w="520"/>
               <w:gridCol w:w="700"/>
               <w:gridCol w:w="520"/>
-              <w:gridCol w:w="520"/>
+              <w:gridCol w:w="740"/>
             </w:tblGrid>
             <w:tr>
               <w:tc>
@@ -2668,7 +5050,7 @@
                       <w:sz w:val="26"/>
                       <w:szCs w:val="26"/>
                     </w:rPr>
-                    <w:t xml:space="preserve">-</w:t>
+                    <w:t xml:space="preserve">−</w:t>
                   </w:r>
                 </w:p>
               </w:tc>
@@ -2816,36 +5198,111 @@
               </w:tc>
               <w:tc>
                 <w:tcPr>
-                  <w:tcW w:type="dxa" w:w="520"/>
-                  <w:tcBorders>
-                    <w:top w:val="none" w:color="FFFFFF" w:sz="0"/>
-                    <w:left w:val="none" w:color="FFFFFF" w:sz="0"/>
-                    <w:bottom w:val="none" w:color="FFFFFF" w:sz="0"/>
-                    <w:right w:val="none" w:color="FFFFFF" w:sz="0"/>
-                  </w:tcBorders>
-                  <w:tcMar>
-                    <w:top w:type="dxa" w:w="30"/>
-                    <w:left w:type="dxa" w:w="10"/>
-                    <w:bottom w:type="dxa" w:w="30"/>
-                    <w:right w:type="dxa" w:w="10"/>
-                  </w:tcMar>
-                  <w:vAlign w:val="center"/>
-                </w:tcPr>
-                <w:p>
-                  <w:pPr>
+                  <w:tcW w:type="dxa" w:w="740"/>
+                  <w:tcBorders>
+                    <w:top w:val="none" w:color="FFFFFF" w:sz="0"/>
+                    <w:left w:val="none" w:color="FFFFFF" w:sz="0"/>
+                    <w:bottom w:val="none" w:color="FFFFFF" w:sz="0"/>
+                    <w:right w:val="none" w:color="FFFFFF" w:sz="0"/>
+                  </w:tcBorders>
+                  <w:tcMar>
+                    <w:top w:type="dxa" w:w="30"/>
+                    <w:left w:type="dxa" w:w="20"/>
+                    <w:bottom w:type="dxa" w:w="30"/>
+                    <w:right w:type="dxa" w:w="20"/>
+                  </w:tcMar>
+                  <w:vAlign w:val="center"/>
+                </w:tcPr>
+                <w:tbl>
+                  <w:tblPr>
+                    <w:tblW w:type="dxa" w:w="640"/>
                     <w:jc w:val="center"/>
-                  </w:pPr>
-                  <w:r>
-                    <w:rPr>
-                      <w:b/>
-                      <w:bCs/>
-                      <w:color w:val="1A1A1A"/>
-                      <w:sz w:val="22"/>
-                      <w:szCs w:val="22"/>
-                    </w:rPr>
-                    <w:t xml:space="preserve">______</w:t>
-                  </w:r>
-                </w:p>
+                    <w:tblBorders>
+                      <w:top w:val="single" w:color="auto" w:sz="4"/>
+                      <w:left w:val="single" w:color="auto" w:sz="4"/>
+                      <w:bottom w:val="single" w:color="auto" w:sz="4"/>
+                      <w:right w:val="single" w:color="auto" w:sz="4"/>
+                      <w:insideH w:val="none" w:color="FFFFFF" w:sz="0"/>
+                      <w:insideV w:val="single" w:color="auto" w:sz="4"/>
+                    </w:tblBorders>
+                  </w:tblPr>
+                  <w:tblGrid>
+                    <w:gridCol w:w="640"/>
+                  </w:tblGrid>
+                  <w:tr>
+                    <w:tc>
+                      <w:tcPr>
+                        <w:tcW w:type="dxa" w:w="520"/>
+                        <w:tcBorders>
+                          <w:top w:val="dashed" w:color="9AA3B5" w:sz="6"/>
+                          <w:left w:val="dashed" w:color="9AA3B5" w:sz="6"/>
+                          <w:bottom w:val="single" w:color="1A1A1A" w:sz="8"/>
+                          <w:right w:val="dashed" w:color="9AA3B5" w:sz="6"/>
+                        </w:tcBorders>
+                        <w:tcMar>
+                          <w:top w:type="dxa" w:w="0"/>
+                          <w:left w:type="dxa" w:w="30"/>
+                          <w:bottom w:type="dxa" w:w="0"/>
+                          <w:right w:type="dxa" w:w="30"/>
+                        </w:tcMar>
+                      </w:tcPr>
+                      <w:p>
+                        <w:pPr>
+                          <w:spacing w:after="0" w:line="250"/>
+                          <w:jc w:val="center"/>
+                        </w:pPr>
+                        <w:r>
+                          <w:rPr>
+                            <w:rFonts w:ascii="Consolas" w:cs="Consolas" w:eastAsia="Consolas" w:hAnsi="Consolas"/>
+                            <w:b/>
+                            <w:bCs/>
+                            <w:color w:val="1A1A1A"/>
+                            <w:sz w:val="26"/>
+                            <w:szCs w:val="26"/>
+                          </w:rPr>
+                          <w:t xml:space="preserve">   </w:t>
+                        </w:r>
+                      </w:p>
+                    </w:tc>
+                  </w:tr>
+                  <w:tr>
+                    <w:tc>
+                      <w:tcPr>
+                        <w:tcW w:type="dxa" w:w="520"/>
+                        <w:tcBorders>
+                          <w:top w:val="none" w:color="FFFFFF" w:sz="0"/>
+                          <w:left w:val="dashed" w:color="9AA3B5" w:sz="6"/>
+                          <w:bottom w:val="dashed" w:color="9AA3B5" w:sz="6"/>
+                          <w:right w:val="dashed" w:color="9AA3B5" w:sz="6"/>
+                        </w:tcBorders>
+                        <w:tcMar>
+                          <w:top w:type="dxa" w:w="0"/>
+                          <w:left w:type="dxa" w:w="30"/>
+                          <w:bottom w:type="dxa" w:w="0"/>
+                          <w:right w:type="dxa" w:w="30"/>
+                        </w:tcMar>
+                      </w:tcPr>
+                      <w:p>
+                        <w:pPr>
+                          <w:spacing w:after="0" w:line="250"/>
+                          <w:jc w:val="center"/>
+                        </w:pPr>
+                        <w:r>
+                          <w:rPr>
+                            <w:rFonts w:ascii="Consolas" w:cs="Consolas" w:eastAsia="Consolas" w:hAnsi="Consolas"/>
+                            <w:b/>
+                            <w:bCs/>
+                            <w:color w:val="1A1A1A"/>
+                            <w:sz w:val="26"/>
+                            <w:szCs w:val="26"/>
+                          </w:rPr>
+                          <w:t xml:space="preserve">   </w:t>
+                        </w:r>
+                      </w:p>
+                    </w:tc>
+                  </w:tr>
+                </w:tbl>
+                <w:p/>
               </w:tc>
             </w:tr>
           </w:tbl>
@@ -2853,6 +5310,9 @@
         </w:tc>
       </w:tr>
       <w:tr>
+        <w:trPr>
+          <w:cantSplit/>
+        </w:trPr>
         <w:tc>
           <w:tcPr>
             <w:tcW w:type="dxa" w:w="4680"/>
@@ -2886,7 +5346,7 @@
           </w:p>
           <w:tbl>
             <w:tblPr>
-              <w:tblW w:type="dxa" w:w="2960"/>
+              <w:tblW w:type="dxa" w:w="3180"/>
               <w:jc w:val="left"/>
               <w:tblBorders>
                 <w:top w:val="single" w:color="auto" w:sz="4"/>
@@ -2902,7 +5362,7 @@
               <w:gridCol w:w="520"/>
               <w:gridCol w:w="700"/>
               <w:gridCol w:w="520"/>
-              <w:gridCol w:w="520"/>
+              <w:gridCol w:w="740"/>
             </w:tblGrid>
             <w:tr>
               <w:tc>
@@ -3191,36 +5651,111 @@
               </w:tc>
               <w:tc>
                 <w:tcPr>
-                  <w:tcW w:type="dxa" w:w="520"/>
-                  <w:tcBorders>
-                    <w:top w:val="none" w:color="FFFFFF" w:sz="0"/>
-                    <w:left w:val="none" w:color="FFFFFF" w:sz="0"/>
-                    <w:bottom w:val="none" w:color="FFFFFF" w:sz="0"/>
-                    <w:right w:val="none" w:color="FFFFFF" w:sz="0"/>
-                  </w:tcBorders>
-                  <w:tcMar>
-                    <w:top w:type="dxa" w:w="30"/>
-                    <w:left w:type="dxa" w:w="10"/>
-                    <w:bottom w:type="dxa" w:w="30"/>
-                    <w:right w:type="dxa" w:w="10"/>
-                  </w:tcMar>
-                  <w:vAlign w:val="center"/>
-                </w:tcPr>
-                <w:p>
-                  <w:pPr>
+                  <w:tcW w:type="dxa" w:w="740"/>
+                  <w:tcBorders>
+                    <w:top w:val="none" w:color="FFFFFF" w:sz="0"/>
+                    <w:left w:val="none" w:color="FFFFFF" w:sz="0"/>
+                    <w:bottom w:val="none" w:color="FFFFFF" w:sz="0"/>
+                    <w:right w:val="none" w:color="FFFFFF" w:sz="0"/>
+                  </w:tcBorders>
+                  <w:tcMar>
+                    <w:top w:type="dxa" w:w="30"/>
+                    <w:left w:type="dxa" w:w="20"/>
+                    <w:bottom w:type="dxa" w:w="30"/>
+                    <w:right w:type="dxa" w:w="20"/>
+                  </w:tcMar>
+                  <w:vAlign w:val="center"/>
+                </w:tcPr>
+                <w:tbl>
+                  <w:tblPr>
+                    <w:tblW w:type="dxa" w:w="640"/>
                     <w:jc w:val="center"/>
-                  </w:pPr>
-                  <w:r>
-                    <w:rPr>
-                      <w:b/>
-                      <w:bCs/>
-                      <w:color w:val="1A1A1A"/>
-                      <w:sz w:val="22"/>
-                      <w:szCs w:val="22"/>
-                    </w:rPr>
-                    <w:t xml:space="preserve">______</w:t>
-                  </w:r>
-                </w:p>
+                    <w:tblBorders>
+                      <w:top w:val="single" w:color="auto" w:sz="4"/>
+                      <w:left w:val="single" w:color="auto" w:sz="4"/>
+                      <w:bottom w:val="single" w:color="auto" w:sz="4"/>
+                      <w:right w:val="single" w:color="auto" w:sz="4"/>
+                      <w:insideH w:val="none" w:color="FFFFFF" w:sz="0"/>
+                      <w:insideV w:val="single" w:color="auto" w:sz="4"/>
+                    </w:tblBorders>
+                  </w:tblPr>
+                  <w:tblGrid>
+                    <w:gridCol w:w="640"/>
+                  </w:tblGrid>
+                  <w:tr>
+                    <w:tc>
+                      <w:tcPr>
+                        <w:tcW w:type="dxa" w:w="520"/>
+                        <w:tcBorders>
+                          <w:top w:val="dashed" w:color="9AA3B5" w:sz="6"/>
+                          <w:left w:val="dashed" w:color="9AA3B5" w:sz="6"/>
+                          <w:bottom w:val="single" w:color="1A1A1A" w:sz="8"/>
+                          <w:right w:val="dashed" w:color="9AA3B5" w:sz="6"/>
+                        </w:tcBorders>
+                        <w:tcMar>
+                          <w:top w:type="dxa" w:w="0"/>
+                          <w:left w:type="dxa" w:w="30"/>
+                          <w:bottom w:type="dxa" w:w="0"/>
+                          <w:right w:type="dxa" w:w="30"/>
+                        </w:tcMar>
+                      </w:tcPr>
+                      <w:p>
+                        <w:pPr>
+                          <w:spacing w:after="0" w:line="250"/>
+                          <w:jc w:val="center"/>
+                        </w:pPr>
+                        <w:r>
+                          <w:rPr>
+                            <w:rFonts w:ascii="Consolas" w:cs="Consolas" w:eastAsia="Consolas" w:hAnsi="Consolas"/>
+                            <w:b/>
+                            <w:bCs/>
+                            <w:color w:val="1A1A1A"/>
+                            <w:sz w:val="26"/>
+                            <w:szCs w:val="26"/>
+                          </w:rPr>
+                          <w:t xml:space="preserve">   </w:t>
+                        </w:r>
+                      </w:p>
+                    </w:tc>
+                  </w:tr>
+                  <w:tr>
+                    <w:tc>
+                      <w:tcPr>
+                        <w:tcW w:type="dxa" w:w="520"/>
+                        <w:tcBorders>
+                          <w:top w:val="none" w:color="FFFFFF" w:sz="0"/>
+                          <w:left w:val="dashed" w:color="9AA3B5" w:sz="6"/>
+                          <w:bottom w:val="dashed" w:color="9AA3B5" w:sz="6"/>
+                          <w:right w:val="dashed" w:color="9AA3B5" w:sz="6"/>
+                        </w:tcBorders>
+                        <w:tcMar>
+                          <w:top w:type="dxa" w:w="0"/>
+                          <w:left w:type="dxa" w:w="30"/>
+                          <w:bottom w:type="dxa" w:w="0"/>
+                          <w:right w:type="dxa" w:w="30"/>
+                        </w:tcMar>
+                      </w:tcPr>
+                      <w:p>
+                        <w:pPr>
+                          <w:spacing w:after="0" w:line="250"/>
+                          <w:jc w:val="center"/>
+                        </w:pPr>
+                        <w:r>
+                          <w:rPr>
+                            <w:rFonts w:ascii="Consolas" w:cs="Consolas" w:eastAsia="Consolas" w:hAnsi="Consolas"/>
+                            <w:b/>
+                            <w:bCs/>
+                            <w:color w:val="1A1A1A"/>
+                            <w:sz w:val="26"/>
+                            <w:szCs w:val="26"/>
+                          </w:rPr>
+                          <w:t xml:space="preserve">   </w:t>
+                        </w:r>
+                      </w:p>
+                    </w:tc>
+                  </w:tr>
+                </w:tbl>
+                <w:p/>
               </w:tc>
             </w:tr>
           </w:tbl>
@@ -3259,7 +5794,7 @@
           </w:p>
           <w:tbl>
             <w:tblPr>
-              <w:tblW w:type="dxa" w:w="2960"/>
+              <w:tblW w:type="dxa" w:w="3180"/>
               <w:jc w:val="left"/>
               <w:tblBorders>
                 <w:top w:val="single" w:color="auto" w:sz="4"/>
@@ -3275,7 +5810,7 @@
               <w:gridCol w:w="520"/>
               <w:gridCol w:w="700"/>
               <w:gridCol w:w="520"/>
-              <w:gridCol w:w="520"/>
+              <w:gridCol w:w="740"/>
             </w:tblGrid>
             <w:tr>
               <w:tc>
@@ -3416,7 +5951,7 @@
                       <w:sz w:val="26"/>
                       <w:szCs w:val="26"/>
                     </w:rPr>
-                    <w:t xml:space="preserve">-</w:t>
+                    <w:t xml:space="preserve">−</w:t>
                   </w:r>
                 </w:p>
               </w:tc>
@@ -3564,36 +6099,111 @@
               </w:tc>
               <w:tc>
                 <w:tcPr>
-                  <w:tcW w:type="dxa" w:w="520"/>
-                  <w:tcBorders>
-                    <w:top w:val="none" w:color="FFFFFF" w:sz="0"/>
-                    <w:left w:val="none" w:color="FFFFFF" w:sz="0"/>
-                    <w:bottom w:val="none" w:color="FFFFFF" w:sz="0"/>
-                    <w:right w:val="none" w:color="FFFFFF" w:sz="0"/>
-                  </w:tcBorders>
-                  <w:tcMar>
-                    <w:top w:type="dxa" w:w="30"/>
-                    <w:left w:type="dxa" w:w="10"/>
-                    <w:bottom w:type="dxa" w:w="30"/>
-                    <w:right w:type="dxa" w:w="10"/>
-                  </w:tcMar>
-                  <w:vAlign w:val="center"/>
-                </w:tcPr>
-                <w:p>
-                  <w:pPr>
+                  <w:tcW w:type="dxa" w:w="740"/>
+                  <w:tcBorders>
+                    <w:top w:val="none" w:color="FFFFFF" w:sz="0"/>
+                    <w:left w:val="none" w:color="FFFFFF" w:sz="0"/>
+                    <w:bottom w:val="none" w:color="FFFFFF" w:sz="0"/>
+                    <w:right w:val="none" w:color="FFFFFF" w:sz="0"/>
+                  </w:tcBorders>
+                  <w:tcMar>
+                    <w:top w:type="dxa" w:w="30"/>
+                    <w:left w:type="dxa" w:w="20"/>
+                    <w:bottom w:type="dxa" w:w="30"/>
+                    <w:right w:type="dxa" w:w="20"/>
+                  </w:tcMar>
+                  <w:vAlign w:val="center"/>
+                </w:tcPr>
+                <w:tbl>
+                  <w:tblPr>
+                    <w:tblW w:type="dxa" w:w="640"/>
                     <w:jc w:val="center"/>
-                  </w:pPr>
-                  <w:r>
-                    <w:rPr>
-                      <w:b/>
-                      <w:bCs/>
-                      <w:color w:val="1A1A1A"/>
-                      <w:sz w:val="22"/>
-                      <w:szCs w:val="22"/>
-                    </w:rPr>
-                    <w:t xml:space="preserve">______</w:t>
-                  </w:r>
-                </w:p>
+                    <w:tblBorders>
+                      <w:top w:val="single" w:color="auto" w:sz="4"/>
+                      <w:left w:val="single" w:color="auto" w:sz="4"/>
+                      <w:bottom w:val="single" w:color="auto" w:sz="4"/>
+                      <w:right w:val="single" w:color="auto" w:sz="4"/>
+                      <w:insideH w:val="none" w:color="FFFFFF" w:sz="0"/>
+                      <w:insideV w:val="single" w:color="auto" w:sz="4"/>
+                    </w:tblBorders>
+                  </w:tblPr>
+                  <w:tblGrid>
+                    <w:gridCol w:w="640"/>
+                  </w:tblGrid>
+                  <w:tr>
+                    <w:tc>
+                      <w:tcPr>
+                        <w:tcW w:type="dxa" w:w="520"/>
+                        <w:tcBorders>
+                          <w:top w:val="dashed" w:color="9AA3B5" w:sz="6"/>
+                          <w:left w:val="dashed" w:color="9AA3B5" w:sz="6"/>
+                          <w:bottom w:val="single" w:color="1A1A1A" w:sz="8"/>
+                          <w:right w:val="dashed" w:color="9AA3B5" w:sz="6"/>
+                        </w:tcBorders>
+                        <w:tcMar>
+                          <w:top w:type="dxa" w:w="0"/>
+                          <w:left w:type="dxa" w:w="30"/>
+                          <w:bottom w:type="dxa" w:w="0"/>
+                          <w:right w:type="dxa" w:w="30"/>
+                        </w:tcMar>
+                      </w:tcPr>
+                      <w:p>
+                        <w:pPr>
+                          <w:spacing w:after="0" w:line="250"/>
+                          <w:jc w:val="center"/>
+                        </w:pPr>
+                        <w:r>
+                          <w:rPr>
+                            <w:rFonts w:ascii="Consolas" w:cs="Consolas" w:eastAsia="Consolas" w:hAnsi="Consolas"/>
+                            <w:b/>
+                            <w:bCs/>
+                            <w:color w:val="1A1A1A"/>
+                            <w:sz w:val="26"/>
+                            <w:szCs w:val="26"/>
+                          </w:rPr>
+                          <w:t xml:space="preserve">   </w:t>
+                        </w:r>
+                      </w:p>
+                    </w:tc>
+                  </w:tr>
+                  <w:tr>
+                    <w:tc>
+                      <w:tcPr>
+                        <w:tcW w:type="dxa" w:w="520"/>
+                        <w:tcBorders>
+                          <w:top w:val="none" w:color="FFFFFF" w:sz="0"/>
+                          <w:left w:val="dashed" w:color="9AA3B5" w:sz="6"/>
+                          <w:bottom w:val="dashed" w:color="9AA3B5" w:sz="6"/>
+                          <w:right w:val="dashed" w:color="9AA3B5" w:sz="6"/>
+                        </w:tcBorders>
+                        <w:tcMar>
+                          <w:top w:type="dxa" w:w="0"/>
+                          <w:left w:type="dxa" w:w="30"/>
+                          <w:bottom w:type="dxa" w:w="0"/>
+                          <w:right w:type="dxa" w:w="30"/>
+                        </w:tcMar>
+                      </w:tcPr>
+                      <w:p>
+                        <w:pPr>
+                          <w:spacing w:after="0" w:line="250"/>
+                          <w:jc w:val="center"/>
+                        </w:pPr>
+                        <w:r>
+                          <w:rPr>
+                            <w:rFonts w:ascii="Consolas" w:cs="Consolas" w:eastAsia="Consolas" w:hAnsi="Consolas"/>
+                            <w:b/>
+                            <w:bCs/>
+                            <w:color w:val="1A1A1A"/>
+                            <w:sz w:val="26"/>
+                            <w:szCs w:val="26"/>
+                          </w:rPr>
+                          <w:t xml:space="preserve">   </w:t>
+                        </w:r>
+                      </w:p>
+                    </w:tc>
+                  </w:tr>
+                </w:tbl>
+                <w:p/>
               </w:tc>
             </w:tr>
           </w:tbl>
@@ -3601,6 +6211,9 @@
         </w:tc>
       </w:tr>
       <w:tr>
+        <w:trPr>
+          <w:cantSplit/>
+        </w:trPr>
         <w:tc>
           <w:tcPr>
             <w:tcW w:type="dxa" w:w="4680"/>
@@ -3634,7 +6247,7 @@
           </w:p>
           <w:tbl>
             <w:tblPr>
-              <w:tblW w:type="dxa" w:w="2960"/>
+              <w:tblW w:type="dxa" w:w="3180"/>
               <w:jc w:val="left"/>
               <w:tblBorders>
                 <w:top w:val="single" w:color="auto" w:sz="4"/>
@@ -3650,7 +6263,7 @@
               <w:gridCol w:w="520"/>
               <w:gridCol w:w="700"/>
               <w:gridCol w:w="520"/>
-              <w:gridCol w:w="520"/>
+              <w:gridCol w:w="740"/>
             </w:tblGrid>
             <w:tr>
               <w:tc>
@@ -3939,36 +6552,111 @@
               </w:tc>
               <w:tc>
                 <w:tcPr>
-                  <w:tcW w:type="dxa" w:w="520"/>
-                  <w:tcBorders>
-                    <w:top w:val="none" w:color="FFFFFF" w:sz="0"/>
-                    <w:left w:val="none" w:color="FFFFFF" w:sz="0"/>
-                    <w:bottom w:val="none" w:color="FFFFFF" w:sz="0"/>
-                    <w:right w:val="none" w:color="FFFFFF" w:sz="0"/>
-                  </w:tcBorders>
-                  <w:tcMar>
-                    <w:top w:type="dxa" w:w="30"/>
-                    <w:left w:type="dxa" w:w="10"/>
-                    <w:bottom w:type="dxa" w:w="30"/>
-                    <w:right w:type="dxa" w:w="10"/>
-                  </w:tcMar>
-                  <w:vAlign w:val="center"/>
-                </w:tcPr>
-                <w:p>
-                  <w:pPr>
+                  <w:tcW w:type="dxa" w:w="740"/>
+                  <w:tcBorders>
+                    <w:top w:val="none" w:color="FFFFFF" w:sz="0"/>
+                    <w:left w:val="none" w:color="FFFFFF" w:sz="0"/>
+                    <w:bottom w:val="none" w:color="FFFFFF" w:sz="0"/>
+                    <w:right w:val="none" w:color="FFFFFF" w:sz="0"/>
+                  </w:tcBorders>
+                  <w:tcMar>
+                    <w:top w:type="dxa" w:w="30"/>
+                    <w:left w:type="dxa" w:w="20"/>
+                    <w:bottom w:type="dxa" w:w="30"/>
+                    <w:right w:type="dxa" w:w="20"/>
+                  </w:tcMar>
+                  <w:vAlign w:val="center"/>
+                </w:tcPr>
+                <w:tbl>
+                  <w:tblPr>
+                    <w:tblW w:type="dxa" w:w="640"/>
                     <w:jc w:val="center"/>
-                  </w:pPr>
-                  <w:r>
-                    <w:rPr>
-                      <w:b/>
-                      <w:bCs/>
-                      <w:color w:val="1A1A1A"/>
-                      <w:sz w:val="22"/>
-                      <w:szCs w:val="22"/>
-                    </w:rPr>
-                    <w:t xml:space="preserve">______</w:t>
-                  </w:r>
-                </w:p>
+                    <w:tblBorders>
+                      <w:top w:val="single" w:color="auto" w:sz="4"/>
+                      <w:left w:val="single" w:color="auto" w:sz="4"/>
+                      <w:bottom w:val="single" w:color="auto" w:sz="4"/>
+                      <w:right w:val="single" w:color="auto" w:sz="4"/>
+                      <w:insideH w:val="none" w:color="FFFFFF" w:sz="0"/>
+                      <w:insideV w:val="single" w:color="auto" w:sz="4"/>
+                    </w:tblBorders>
+                  </w:tblPr>
+                  <w:tblGrid>
+                    <w:gridCol w:w="640"/>
+                  </w:tblGrid>
+                  <w:tr>
+                    <w:tc>
+                      <w:tcPr>
+                        <w:tcW w:type="dxa" w:w="520"/>
+                        <w:tcBorders>
+                          <w:top w:val="dashed" w:color="9AA3B5" w:sz="6"/>
+                          <w:left w:val="dashed" w:color="9AA3B5" w:sz="6"/>
+                          <w:bottom w:val="single" w:color="1A1A1A" w:sz="8"/>
+                          <w:right w:val="dashed" w:color="9AA3B5" w:sz="6"/>
+                        </w:tcBorders>
+                        <w:tcMar>
+                          <w:top w:type="dxa" w:w="0"/>
+                          <w:left w:type="dxa" w:w="30"/>
+                          <w:bottom w:type="dxa" w:w="0"/>
+                          <w:right w:type="dxa" w:w="30"/>
+                        </w:tcMar>
+                      </w:tcPr>
+                      <w:p>
+                        <w:pPr>
+                          <w:spacing w:after="0" w:line="250"/>
+                          <w:jc w:val="center"/>
+                        </w:pPr>
+                        <w:r>
+                          <w:rPr>
+                            <w:rFonts w:ascii="Consolas" w:cs="Consolas" w:eastAsia="Consolas" w:hAnsi="Consolas"/>
+                            <w:b/>
+                            <w:bCs/>
+                            <w:color w:val="1A1A1A"/>
+                            <w:sz w:val="26"/>
+                            <w:szCs w:val="26"/>
+                          </w:rPr>
+                          <w:t xml:space="preserve">   </w:t>
+                        </w:r>
+                      </w:p>
+                    </w:tc>
+                  </w:tr>
+                  <w:tr>
+                    <w:tc>
+                      <w:tcPr>
+                        <w:tcW w:type="dxa" w:w="520"/>
+                        <w:tcBorders>
+                          <w:top w:val="none" w:color="FFFFFF" w:sz="0"/>
+                          <w:left w:val="dashed" w:color="9AA3B5" w:sz="6"/>
+                          <w:bottom w:val="dashed" w:color="9AA3B5" w:sz="6"/>
+                          <w:right w:val="dashed" w:color="9AA3B5" w:sz="6"/>
+                        </w:tcBorders>
+                        <w:tcMar>
+                          <w:top w:type="dxa" w:w="0"/>
+                          <w:left w:type="dxa" w:w="30"/>
+                          <w:bottom w:type="dxa" w:w="0"/>
+                          <w:right w:type="dxa" w:w="30"/>
+                        </w:tcMar>
+                      </w:tcPr>
+                      <w:p>
+                        <w:pPr>
+                          <w:spacing w:after="0" w:line="250"/>
+                          <w:jc w:val="center"/>
+                        </w:pPr>
+                        <w:r>
+                          <w:rPr>
+                            <w:rFonts w:ascii="Consolas" w:cs="Consolas" w:eastAsia="Consolas" w:hAnsi="Consolas"/>
+                            <w:b/>
+                            <w:bCs/>
+                            <w:color w:val="1A1A1A"/>
+                            <w:sz w:val="26"/>
+                            <w:szCs w:val="26"/>
+                          </w:rPr>
+                          <w:t xml:space="preserve">   </w:t>
+                        </w:r>
+                      </w:p>
+                    </w:tc>
+                  </w:tr>
+                </w:tbl>
+                <w:p/>
               </w:tc>
             </w:tr>
           </w:tbl>
@@ -4007,7 +6695,7 @@
           </w:p>
           <w:tbl>
             <w:tblPr>
-              <w:tblW w:type="dxa" w:w="2960"/>
+              <w:tblW w:type="dxa" w:w="3180"/>
               <w:jc w:val="left"/>
               <w:tblBorders>
                 <w:top w:val="single" w:color="auto" w:sz="4"/>
@@ -4023,7 +6711,7 @@
               <w:gridCol w:w="520"/>
               <w:gridCol w:w="700"/>
               <w:gridCol w:w="520"/>
-              <w:gridCol w:w="520"/>
+              <w:gridCol w:w="740"/>
             </w:tblGrid>
             <w:tr>
               <w:tc>
@@ -4164,7 +6852,7 @@
                       <w:sz w:val="26"/>
                       <w:szCs w:val="26"/>
                     </w:rPr>
-                    <w:t xml:space="preserve">-</w:t>
+                    <w:t xml:space="preserve">−</w:t>
                   </w:r>
                 </w:p>
               </w:tc>
@@ -4312,36 +7000,111 @@
               </w:tc>
               <w:tc>
                 <w:tcPr>
-                  <w:tcW w:type="dxa" w:w="520"/>
-                  <w:tcBorders>
-                    <w:top w:val="none" w:color="FFFFFF" w:sz="0"/>
-                    <w:left w:val="none" w:color="FFFFFF" w:sz="0"/>
-                    <w:bottom w:val="none" w:color="FFFFFF" w:sz="0"/>
-                    <w:right w:val="none" w:color="FFFFFF" w:sz="0"/>
-                  </w:tcBorders>
-                  <w:tcMar>
-                    <w:top w:type="dxa" w:w="30"/>
-                    <w:left w:type="dxa" w:w="10"/>
-                    <w:bottom w:type="dxa" w:w="30"/>
-                    <w:right w:type="dxa" w:w="10"/>
-                  </w:tcMar>
-                  <w:vAlign w:val="center"/>
-                </w:tcPr>
-                <w:p>
-                  <w:pPr>
+                  <w:tcW w:type="dxa" w:w="740"/>
+                  <w:tcBorders>
+                    <w:top w:val="none" w:color="FFFFFF" w:sz="0"/>
+                    <w:left w:val="none" w:color="FFFFFF" w:sz="0"/>
+                    <w:bottom w:val="none" w:color="FFFFFF" w:sz="0"/>
+                    <w:right w:val="none" w:color="FFFFFF" w:sz="0"/>
+                  </w:tcBorders>
+                  <w:tcMar>
+                    <w:top w:type="dxa" w:w="30"/>
+                    <w:left w:type="dxa" w:w="20"/>
+                    <w:bottom w:type="dxa" w:w="30"/>
+                    <w:right w:type="dxa" w:w="20"/>
+                  </w:tcMar>
+                  <w:vAlign w:val="center"/>
+                </w:tcPr>
+                <w:tbl>
+                  <w:tblPr>
+                    <w:tblW w:type="dxa" w:w="640"/>
                     <w:jc w:val="center"/>
-                  </w:pPr>
-                  <w:r>
-                    <w:rPr>
-                      <w:b/>
-                      <w:bCs/>
-                      <w:color w:val="1A1A1A"/>
-                      <w:sz w:val="22"/>
-                      <w:szCs w:val="22"/>
-                    </w:rPr>
-                    <w:t xml:space="preserve">______</w:t>
-                  </w:r>
-                </w:p>
+                    <w:tblBorders>
+                      <w:top w:val="single" w:color="auto" w:sz="4"/>
+                      <w:left w:val="single" w:color="auto" w:sz="4"/>
+                      <w:bottom w:val="single" w:color="auto" w:sz="4"/>
+                      <w:right w:val="single" w:color="auto" w:sz="4"/>
+                      <w:insideH w:val="none" w:color="FFFFFF" w:sz="0"/>
+                      <w:insideV w:val="single" w:color="auto" w:sz="4"/>
+                    </w:tblBorders>
+                  </w:tblPr>
+                  <w:tblGrid>
+                    <w:gridCol w:w="640"/>
+                  </w:tblGrid>
+                  <w:tr>
+                    <w:tc>
+                      <w:tcPr>
+                        <w:tcW w:type="dxa" w:w="520"/>
+                        <w:tcBorders>
+                          <w:top w:val="dashed" w:color="9AA3B5" w:sz="6"/>
+                          <w:left w:val="dashed" w:color="9AA3B5" w:sz="6"/>
+                          <w:bottom w:val="single" w:color="1A1A1A" w:sz="8"/>
+                          <w:right w:val="dashed" w:color="9AA3B5" w:sz="6"/>
+                        </w:tcBorders>
+                        <w:tcMar>
+                          <w:top w:type="dxa" w:w="0"/>
+                          <w:left w:type="dxa" w:w="30"/>
+                          <w:bottom w:type="dxa" w:w="0"/>
+                          <w:right w:type="dxa" w:w="30"/>
+                        </w:tcMar>
+                      </w:tcPr>
+                      <w:p>
+                        <w:pPr>
+                          <w:spacing w:after="0" w:line="250"/>
+                          <w:jc w:val="center"/>
+                        </w:pPr>
+                        <w:r>
+                          <w:rPr>
+                            <w:rFonts w:ascii="Consolas" w:cs="Consolas" w:eastAsia="Consolas" w:hAnsi="Consolas"/>
+                            <w:b/>
+                            <w:bCs/>
+                            <w:color w:val="1A1A1A"/>
+                            <w:sz w:val="26"/>
+                            <w:szCs w:val="26"/>
+                          </w:rPr>
+                          <w:t xml:space="preserve">   </w:t>
+                        </w:r>
+                      </w:p>
+                    </w:tc>
+                  </w:tr>
+                  <w:tr>
+                    <w:tc>
+                      <w:tcPr>
+                        <w:tcW w:type="dxa" w:w="520"/>
+                        <w:tcBorders>
+                          <w:top w:val="none" w:color="FFFFFF" w:sz="0"/>
+                          <w:left w:val="dashed" w:color="9AA3B5" w:sz="6"/>
+                          <w:bottom w:val="dashed" w:color="9AA3B5" w:sz="6"/>
+                          <w:right w:val="dashed" w:color="9AA3B5" w:sz="6"/>
+                        </w:tcBorders>
+                        <w:tcMar>
+                          <w:top w:type="dxa" w:w="0"/>
+                          <w:left w:type="dxa" w:w="30"/>
+                          <w:bottom w:type="dxa" w:w="0"/>
+                          <w:right w:type="dxa" w:w="30"/>
+                        </w:tcMar>
+                      </w:tcPr>
+                      <w:p>
+                        <w:pPr>
+                          <w:spacing w:after="0" w:line="250"/>
+                          <w:jc w:val="center"/>
+                        </w:pPr>
+                        <w:r>
+                          <w:rPr>
+                            <w:rFonts w:ascii="Consolas" w:cs="Consolas" w:eastAsia="Consolas" w:hAnsi="Consolas"/>
+                            <w:b/>
+                            <w:bCs/>
+                            <w:color w:val="1A1A1A"/>
+                            <w:sz w:val="26"/>
+                            <w:szCs w:val="26"/>
+                          </w:rPr>
+                          <w:t xml:space="preserve">   </w:t>
+                        </w:r>
+                      </w:p>
+                    </w:tc>
+                  </w:tr>
+                </w:tbl>
+                <w:p/>
               </w:tc>
             </w:tr>
           </w:tbl>

</xml_diff>